<commit_message>
se incorporó prompts y especificaciones a método de clúster
</commit_message>
<xml_diff>
--- a/TP2/TP2_Programacion_Grupo3.docx
+++ b/TP2/TP2_Programacion_Grupo3.docx
@@ -1862,10 +1862,10 @@
     </w:p>
     <w:p>
       <w:pPr>
-        <w:pStyle w:val="Prrafodelista"/>
+        <w:pStyle w:val="Ttulo1"/>
         <w:numPr>
-          <w:ilvl w:val="0"/>
-          <w:numId w:val="3"/>
+          <w:ilvl w:val="1"/>
+          <w:numId w:val="2"/>
         </w:numPr>
         <w:rPr>
           <w:lang w:val="es-US"/>
@@ -1875,21 +1875,60 @@
         <w:rPr>
           <w:lang w:val="es-US"/>
         </w:rPr>
-        <w:t>Continuaremos trabajando con la base trabajada en la anterior ocasión</w:t>
-      </w:r>
-      <w:r>
-        <w:rPr>
-          <w:lang w:val="es-US"/>
-        </w:rPr>
-        <w:t>, la base se llama ocupados</w:t>
-      </w:r>
-    </w:p>
-    <w:p>
-      <w:pPr>
-        <w:pStyle w:val="Prrafodelista"/>
+        <w:t>Reflexiones finales</w:t>
+      </w:r>
+    </w:p>
+    <w:p>
+      <w:pPr>
+        <w:rPr>
+          <w:szCs w:val="20"/>
+        </w:rPr>
+      </w:pPr>
+      <w:r>
+        <w:rPr>
+          <w:szCs w:val="20"/>
+        </w:rPr>
+        <w:t xml:space="preserve">Por una parte, se valora la contribución de la inteligencia artificial como herramienta de aprendizaje y programación, remarcando su utilidad para acceder rápidamente a la base de datos y, al mismo tiempo, para generar código que se interprete con claridad en Python, aunque se considera que el apoyo fue menos relevante en la fase interpretativa. A continuación, un registro de </w:t>
+      </w:r>
+      <w:r>
+        <w:rPr>
+          <w:i/>
+          <w:iCs/>
+          <w:szCs w:val="20"/>
+        </w:rPr>
+        <w:t>prompts</w:t>
+      </w:r>
+      <w:r>
+        <w:rPr>
+          <w:szCs w:val="20"/>
+        </w:rPr>
+        <w:t xml:space="preserve"> que se van utilizando a lo largo del desarrollo, y que se refiere a un apéndice. Finalmente, se valora el tiempo total dedicado a este trabajo, teniendo en cuenta las dificultades </w:t>
+      </w:r>
+      <w:r>
+        <w:rPr>
+          <w:szCs w:val="20"/>
+        </w:rPr>
+        <w:t>del tiempo de</w:t>
+      </w:r>
+      <w:r>
+        <w:rPr>
+          <w:szCs w:val="20"/>
+        </w:rPr>
+        <w:t xml:space="preserve"> entrega, que se asocian principalmente a un aprendizaje lento al adaptarse a nuevas herramientas de trabajo colaborativo</w:t>
+      </w:r>
+      <w:r>
+        <w:rPr>
+          <w:szCs w:val="20"/>
+        </w:rPr>
+        <w:t xml:space="preserve"> y de conceptos que anteriormente no se ha visto.</w:t>
+      </w:r>
+    </w:p>
+    <w:p>
+      <w:pPr>
+        <w:pStyle w:val="Ttulo1"/>
         <w:numPr>
-          <w:ilvl w:val="0"/>
-          <w:numId w:val="3"/>
+          <w:ilvl w:val="1"/>
+          <w:numId w:val="2"/>
         </w:numPr>
         <w:rPr>
           <w:lang w:val="es-US"/>
@@ -1899,15 +1938,16 @@
         <w:rPr>
           <w:lang w:val="es-US"/>
         </w:rPr>
-        <w:t>Mira las siguientes variables: estas variables las utilizaré para hacer un clúster, mi idea es comparar con el indicador de informalidad construido, para ello los pasos son los siguientes: usemos un k=2 y n_init=20, el clúster solo elabóralo con las 7 variables mostradas, y sobre compararemos, con el indicador. La forma en que se comparara es: Coloquemos 2 gráficos de edad e ingreso de ocupación principal (tal como te mostré en la imagen), el primero agrupado con la clasificación del clúster y el segundo con la clasificación del índice de informalidad. Nota importante no te olvides de estandarizar las variables. Existe información adicional que necesitas para realizar la tarea encomendada?</w:t>
-      </w:r>
-    </w:p>
-    <w:p>
-      <w:pPr>
-        <w:pStyle w:val="Prrafodelista"/>
+        <w:lastRenderedPageBreak/>
+        <w:t>Prompts usados (Apéndice 1)</w:t>
+      </w:r>
+    </w:p>
+    <w:p>
+      <w:pPr>
+        <w:pStyle w:val="Ttulo1"/>
         <w:numPr>
-          <w:ilvl w:val="0"/>
-          <w:numId w:val="3"/>
+          <w:ilvl w:val="1"/>
+          <w:numId w:val="2"/>
         </w:numPr>
         <w:rPr>
           <w:lang w:val="es-US"/>
@@ -1917,236 +1957,98 @@
         <w:rPr>
           <w:lang w:val="es-US"/>
         </w:rPr>
-        <w:t>Construye el gráfico de codo sobre la base del clústeres con k=1 hasta k=40</w:t>
-      </w:r>
-    </w:p>
-    <w:p>
-      <w:pPr>
-        <w:pStyle w:val="Prrafodelista"/>
-        <w:numPr>
-          <w:ilvl w:val="0"/>
-          <w:numId w:val="3"/>
-        </w:numPr>
-        <w:rPr>
-          <w:lang w:val="es-US"/>
-        </w:rPr>
-      </w:pPr>
-      <w:r>
-        <w:rPr>
-          <w:lang w:val="es-US"/>
-        </w:rPr>
-        <w:lastRenderedPageBreak/>
-        <w:t>Explicame que es un dendograma, también es necesario estandarizar?</w:t>
-      </w:r>
-    </w:p>
-    <w:p>
-      <w:pPr>
-        <w:pStyle w:val="Prrafodelista"/>
-        <w:numPr>
-          <w:ilvl w:val="0"/>
-          <w:numId w:val="3"/>
-        </w:numPr>
-        <w:rPr>
-          <w:lang w:val="es-US"/>
-        </w:rPr>
-      </w:pPr>
-      <w:r>
-        <w:rPr>
-          <w:lang w:val="es-US"/>
-        </w:rPr>
-        <w:t>De acuerdo, sobre las variables que aplicadas en el clúster k=2 y el gráfico de codo, apliquemos el dendograma</w:t>
-      </w:r>
-    </w:p>
-    <w:p>
-      <w:pPr>
-        <w:pStyle w:val="Prrafodelista"/>
-        <w:numPr>
-          <w:ilvl w:val="0"/>
-          <w:numId w:val="3"/>
-        </w:numPr>
-        <w:rPr>
-          <w:lang w:val="es-US"/>
-        </w:rPr>
-      </w:pPr>
-      <w:r>
-        <w:rPr>
-          <w:lang w:val="es-US"/>
-        </w:rPr>
-        <w:t>Entiendo que si el agrupamiento de 2 cluster es más alto, significa que el algoritmo recomienda un k=2, en este caso veo que seria entre 4 y 5 aprox (mira la imagen cargada), te parece que es correcta esa interpretación?</w:t>
-      </w:r>
-    </w:p>
-    <w:p>
-      <w:pPr>
-        <w:pStyle w:val="Prrafodelista"/>
-        <w:numPr>
-          <w:ilvl w:val="0"/>
-          <w:numId w:val="3"/>
-        </w:numPr>
-        <w:rPr>
-          <w:lang w:val="es-US"/>
-        </w:rPr>
-      </w:pPr>
-      <w:r>
-        <w:rPr>
-          <w:lang w:val="es-US"/>
-        </w:rPr>
-        <w:t>En que se diferencia el dendograma como lo que venimos trabajando</w:t>
-      </w:r>
-      <w:r>
-        <w:rPr>
-          <w:lang w:val="es-US"/>
-        </w:rPr>
-        <w:t>?</w:t>
-      </w:r>
-    </w:p>
-    <w:p>
-      <w:pPr>
-        <w:pStyle w:val="Prrafodelista"/>
-        <w:numPr>
-          <w:ilvl w:val="0"/>
-          <w:numId w:val="3"/>
-        </w:numPr>
-        <w:rPr>
-          <w:lang w:val="es-US"/>
-        </w:rPr>
-      </w:pPr>
-      <w:r>
-        <w:rPr>
-          <w:lang w:val="es-US"/>
-        </w:rPr>
-        <w:t>Es correcto que usemos menos muestra que en K-medias?</w:t>
-      </w:r>
-    </w:p>
-    <w:p>
-      <w:pPr>
-        <w:pStyle w:val="Prrafodelista"/>
-        <w:numPr>
-          <w:ilvl w:val="0"/>
-          <w:numId w:val="3"/>
-        </w:numPr>
-        <w:rPr>
-          <w:lang w:val="es-US"/>
-        </w:rPr>
-      </w:pPr>
-      <w:r>
-        <w:rPr>
-          <w:lang w:val="es-US"/>
-        </w:rPr>
-        <w:t>Existe ganancia adicional en usar mayor muestra?</w:t>
-      </w:r>
-    </w:p>
-    <w:p>
-      <w:pPr>
-        <w:pStyle w:val="Prrafodelista"/>
-        <w:numPr>
-          <w:ilvl w:val="0"/>
-          <w:numId w:val="3"/>
-        </w:numPr>
-        <w:rPr>
-          <w:lang w:val="es-US"/>
-        </w:rPr>
-      </w:pPr>
-      <w:r>
-        <w:rPr>
-          <w:lang w:val="es-US"/>
-        </w:rPr>
-        <w:t>Perfecto, ahora pasemos al método de k-modas, la aplicación será a partir de variables categóricas y numéricas, entonces primero necesito identificar de forma clara todas las variables de la base, para ello te coloco los resultado del ocupados.info() pero además necesito que me pases un código más legible para ver todas las variables por categoría de formas más ordenada</w:t>
-      </w:r>
-    </w:p>
-    <w:p>
-      <w:pPr>
-        <w:pStyle w:val="Prrafodelista"/>
-        <w:numPr>
-          <w:ilvl w:val="0"/>
-          <w:numId w:val="3"/>
-        </w:numPr>
-        <w:rPr>
-          <w:lang w:val="es-US"/>
-        </w:rPr>
-      </w:pPr>
-      <w:r>
-        <w:rPr>
-          <w:lang w:val="es-US"/>
-        </w:rPr>
-        <w:t>Perfecto, estos son los resultados, aquí podrás ver las variables y su respectivo tipo. Muchas de las variables son categóricas, es necesario que las que tienen más de 1 nivel se conviertan en dummy?</w:t>
-      </w:r>
-    </w:p>
-    <w:p>
-      <w:pPr>
-        <w:pStyle w:val="Prrafodelista"/>
-        <w:numPr>
-          <w:ilvl w:val="0"/>
-          <w:numId w:val="3"/>
-        </w:numPr>
-        <w:rPr>
-          <w:lang w:val="es-US"/>
-        </w:rPr>
-      </w:pPr>
-      <w:r>
-        <w:rPr>
-          <w:lang w:val="es-US"/>
-        </w:rPr>
-        <w:t>Que es la distancia de Hamming?</w:t>
-      </w:r>
-    </w:p>
-    <w:p>
-      <w:pPr>
-        <w:pStyle w:val="Prrafodelista"/>
-        <w:numPr>
-          <w:ilvl w:val="0"/>
-          <w:numId w:val="3"/>
-        </w:numPr>
-        <w:rPr>
-          <w:lang w:val="es-US"/>
-        </w:rPr>
-      </w:pPr>
-      <w:r>
-        <w:rPr>
-          <w:lang w:val="es-US"/>
-        </w:rPr>
-        <w:t>Perfecto entonces pasemos a la aplicación,</w:t>
-      </w:r>
-    </w:p>
-    <w:p>
-      <w:pPr>
-        <w:pStyle w:val="Prrafodelista"/>
-        <w:numPr>
-          <w:ilvl w:val="0"/>
-          <w:numId w:val="3"/>
-        </w:numPr>
-        <w:rPr>
-          <w:lang w:val="es-US"/>
-        </w:rPr>
-      </w:pPr>
-      <w:r>
-        <w:rPr>
-          <w:lang w:val="es-US"/>
-        </w:rPr>
-        <w:t>Pasemos al método del codo, análogo a lo hecho en k-medias</w:t>
-      </w:r>
-    </w:p>
-    <w:p>
-      <w:pPr>
-        <w:pStyle w:val="Prrafodelista"/>
-        <w:numPr>
-          <w:ilvl w:val="0"/>
-          <w:numId w:val="3"/>
-        </w:numPr>
-        <w:rPr>
-          <w:lang w:val="es-US"/>
-        </w:rPr>
-      </w:pPr>
-      <w:r>
-        <w:rPr>
-          <w:lang w:val="es-US"/>
-        </w:rPr>
-        <w:t>Podrías comparar los métodos de codo hecho en k medias y k modas, estos son los códigos aplicados</w:t>
+        <w:t>Tiempo estimado</w:t>
       </w:r>
     </w:p>
     <w:p>
       <w:pPr>
         <w:rPr>
           <w:szCs w:val="20"/>
+        </w:rPr>
+      </w:pPr>
+      <w:r>
+        <w:rPr>
+          <w:szCs w:val="20"/>
+        </w:rPr>
+        <w:t>Pese a la utilidad que representa la IA, al tratarse del primer trabajo práctico, el proceso ha demandado un tiempo considerable, principalmente debido a la adaptación al uso de GitHub, al aprendizaje de su funcionamiento</w:t>
+      </w:r>
+      <w:r>
+        <w:rPr>
+          <w:szCs w:val="20"/>
+        </w:rPr>
+        <w:t>, los</w:t>
+      </w:r>
+      <w:r>
+        <w:rPr>
+          <w:szCs w:val="20"/>
+        </w:rPr>
+        <w:t xml:space="preserve"> otros costos de transacción propios </w:t>
+      </w:r>
+      <w:r>
+        <w:rPr>
+          <w:szCs w:val="20"/>
+        </w:rPr>
+        <w:t>del trabajo virtual</w:t>
+      </w:r>
+      <w:r>
+        <w:rPr>
+          <w:szCs w:val="20"/>
+        </w:rPr>
+        <w:t>,</w:t>
+      </w:r>
+      <w:r>
+        <w:rPr>
+          <w:szCs w:val="20"/>
+        </w:rPr>
+        <w:t xml:space="preserve"> pero que afortunadamente han mejorado, además la adecuación a nuevos conceptos como cluster jerárquicos y k-modas los cuales resultaron retadores</w:t>
+      </w:r>
+      <w:r>
+        <w:rPr>
+          <w:szCs w:val="20"/>
+        </w:rPr>
+        <w:t>. En conjunto, esto ha supuesto una dedicación de aproximadamente 1</w:t>
+      </w:r>
+      <w:r>
+        <w:rPr>
+          <w:szCs w:val="20"/>
+        </w:rPr>
+        <w:t>5</w:t>
+      </w:r>
+      <w:r>
+        <w:rPr>
+          <w:szCs w:val="20"/>
+        </w:rPr>
+        <w:t xml:space="preserve"> horas. Se espera que este tiempo se reduzca en los próximos entregables, considerando</w:t>
+      </w:r>
+      <w:r>
+        <w:rPr>
+          <w:szCs w:val="20"/>
+        </w:rPr>
+        <w:t>,</w:t>
+      </w:r>
+      <w:r>
+        <w:rPr>
+          <w:szCs w:val="20"/>
+        </w:rPr>
+        <w:t xml:space="preserve"> además</w:t>
+      </w:r>
+      <w:r>
+        <w:rPr>
+          <w:szCs w:val="20"/>
+        </w:rPr>
+        <w:t>,</w:t>
+      </w:r>
+      <w:r>
+        <w:rPr>
+          <w:szCs w:val="20"/>
+        </w:rPr>
+        <w:t xml:space="preserve"> el escaso margen temporal entre ellos según el cronograma y la existencia de otras responsabilidades que deben atenderse en paralelo.</w:t>
+      </w:r>
+    </w:p>
+    <w:p>
+      <w:pPr>
+        <w:rPr>
+          <w:lang w:val="es-US"/>
         </w:rPr>
       </w:pPr>
     </w:p>
@@ -2552,6 +2454,7 @@
         <w:rPr>
           <w:b/>
           <w:bCs/>
+          <w:noProof/>
           <w:lang w:val="es-PE"/>
         </w:rPr>
         <w:drawing>
@@ -2693,6 +2596,7 @@
       </w:r>
       <w:r>
         <w:rPr>
+          <w:noProof/>
           <w:lang w:val="es-PE"/>
         </w:rPr>
         <w:drawing>
@@ -2784,6 +2688,7 @@
         <w:rPr>
           <w:b/>
           <w:bCs/>
+          <w:noProof/>
           <w:lang w:val="es-PE"/>
         </w:rPr>
         <w:drawing>
@@ -2876,6 +2781,7 @@
         <w:rPr>
           <w:b/>
           <w:bCs/>
+          <w:noProof/>
           <w:lang w:val="es-PE"/>
         </w:rPr>
         <w:lastRenderedPageBreak/>
@@ -2942,31 +2848,7 @@
           <w:bCs/>
           <w:lang w:val="es-PE"/>
         </w:rPr>
-        <w:t>Gráfico 3.</w:t>
-      </w:r>
-      <w:r>
-        <w:rPr>
-          <w:b/>
-          <w:bCs/>
-          <w:lang w:val="es-PE"/>
-        </w:rPr>
-        <w:t>4</w:t>
-      </w:r>
-      <w:r>
-        <w:rPr>
-          <w:b/>
-          <w:bCs/>
-          <w:lang w:val="es-PE"/>
-        </w:rPr>
-        <w:t xml:space="preserve">: </w:t>
-      </w:r>
-      <w:r>
-        <w:rPr>
-          <w:b/>
-          <w:bCs/>
-          <w:lang w:val="es-PE"/>
-        </w:rPr>
-        <w:t>Composición del indicador de informalidad bajo agrupamiento de K-modas</w:t>
+        <w:t>Gráfico 3.4: Composición del indicador de informalidad bajo agrupamiento de K-modas</w:t>
       </w:r>
     </w:p>
     <w:p>
@@ -3002,23 +2884,7 @@
           <w:bCs/>
           <w:lang w:val="es-PE"/>
         </w:rPr>
-        <w:t>Gráfico 3.</w:t>
-      </w:r>
-      <w:r>
-        <w:rPr>
-          <w:b/>
-          <w:bCs/>
-          <w:lang w:val="es-PE"/>
-        </w:rPr>
-        <w:t>5</w:t>
-      </w:r>
-      <w:r>
-        <w:rPr>
-          <w:b/>
-          <w:bCs/>
-          <w:lang w:val="es-PE"/>
-        </w:rPr>
-        <w:t xml:space="preserve">: </w:t>
+        <w:t xml:space="preserve">Gráfico 3.5: </w:t>
       </w:r>
       <w:r>
         <w:rPr>
@@ -3133,54 +2999,23 @@
           <w:bCs/>
           <w:lang w:val="es-PE"/>
         </w:rPr>
-        <w:t>Gráfico 3.</w:t>
-      </w:r>
-      <w:r>
+        <w:t xml:space="preserve">Gráfico 3.6: Comparación de las curvas de codo: K-medias y K-modas </w:t>
+      </w:r>
+    </w:p>
+    <w:p>
+      <w:pPr>
+        <w:jc w:val="center"/>
         <w:rPr>
           <w:b/>
           <w:bCs/>
           <w:lang w:val="es-PE"/>
         </w:rPr>
-        <w:t>6</w:t>
-      </w:r>
+      </w:pPr>
       <w:r>
         <w:rPr>
           <w:b/>
           <w:bCs/>
-          <w:lang w:val="es-PE"/>
-        </w:rPr>
-        <w:t xml:space="preserve">: </w:t>
-      </w:r>
-      <w:r>
-        <w:rPr>
-          <w:b/>
-          <w:bCs/>
-          <w:lang w:val="es-PE"/>
-        </w:rPr>
-        <w:t>Comparación de las curvas de codo: K-medias y K-modas</w:t>
-      </w:r>
-      <w:r>
-        <w:rPr>
-          <w:b/>
-          <w:bCs/>
-          <w:lang w:val="es-PE"/>
-        </w:rPr>
-        <w:t xml:space="preserve"> </w:t>
-      </w:r>
-    </w:p>
-    <w:p>
-      <w:pPr>
-        <w:jc w:val="center"/>
-        <w:rPr>
-          <w:b/>
-          <w:bCs/>
-          <w:lang w:val="es-PE"/>
-        </w:rPr>
-      </w:pPr>
-      <w:r>
-        <w:rPr>
-          <w:b/>
-          <w:bCs/>
+          <w:noProof/>
           <w:lang w:val="es-PE"/>
         </w:rPr>
         <w:drawing>
@@ -3236,6 +3071,317 @@
           <w:lang w:val="es-PE"/>
         </w:rPr>
         <w:t>Fuente: EPH. Elaboración propia</w:t>
+      </w:r>
+    </w:p>
+    <w:p>
+      <w:pPr>
+        <w:jc w:val="left"/>
+        <w:rPr>
+          <w:b/>
+          <w:bCs/>
+          <w:lang w:val="es-PE"/>
+        </w:rPr>
+      </w:pPr>
+      <w:r>
+        <w:rPr>
+          <w:b/>
+          <w:bCs/>
+          <w:lang w:val="es-PE"/>
+        </w:rPr>
+        <w:t>Apéndice 1</w:t>
+      </w:r>
+      <w:r>
+        <w:rPr>
+          <w:b/>
+          <w:bCs/>
+          <w:lang w:val="es-PE"/>
+        </w:rPr>
+        <w:t xml:space="preserve">: </w:t>
+      </w:r>
+      <w:r>
+        <w:rPr>
+          <w:b/>
+          <w:bCs/>
+          <w:lang w:val="es-PE"/>
+        </w:rPr>
+        <w:t>Prompts utilizados</w:t>
+      </w:r>
+    </w:p>
+    <w:p>
+      <w:pPr>
+        <w:pStyle w:val="Prrafodelista"/>
+        <w:numPr>
+          <w:ilvl w:val="0"/>
+          <w:numId w:val="3"/>
+        </w:numPr>
+        <w:rPr>
+          <w:lang w:val="es-US"/>
+        </w:rPr>
+      </w:pPr>
+      <w:r>
+        <w:rPr>
+          <w:lang w:val="es-US"/>
+        </w:rPr>
+        <w:t>Continuaremos trabajando con la base trabajada en la anterior ocasión, la base se llama ocupados</w:t>
+      </w:r>
+    </w:p>
+    <w:p>
+      <w:pPr>
+        <w:pStyle w:val="Prrafodelista"/>
+        <w:numPr>
+          <w:ilvl w:val="0"/>
+          <w:numId w:val="3"/>
+        </w:numPr>
+        <w:rPr>
+          <w:lang w:val="es-US"/>
+        </w:rPr>
+      </w:pPr>
+      <w:r>
+        <w:rPr>
+          <w:lang w:val="es-US"/>
+        </w:rPr>
+        <w:t xml:space="preserve">Mira las siguientes variables: estas variables las utilizaré para hacer un clúster, mi idea es comparar con el indicador de informalidad construido, para ello los pasos son los siguientes: usemos un k=2 y n_init=20, el clúster solo elabóralo con las 7 variables mostradas, y sobre compararemos, con el indicador. La forma en que se comparara es: Coloquemos 2 gráficos de edad e ingreso de ocupación principal (tal como te mostré en la imagen), el primero agrupado con la clasificación </w:t>
+      </w:r>
+      <w:r>
+        <w:rPr>
+          <w:lang w:val="es-US"/>
+        </w:rPr>
+        <w:lastRenderedPageBreak/>
+        <w:t>del clúster y el segundo con la clasificación del índice de informalidad. Nota importante no te olvides de estandarizar las variables. Existe información adicional que necesitas para realizar la tarea encomendada?</w:t>
+      </w:r>
+    </w:p>
+    <w:p>
+      <w:pPr>
+        <w:pStyle w:val="Prrafodelista"/>
+        <w:numPr>
+          <w:ilvl w:val="0"/>
+          <w:numId w:val="3"/>
+        </w:numPr>
+        <w:rPr>
+          <w:lang w:val="es-US"/>
+        </w:rPr>
+      </w:pPr>
+      <w:r>
+        <w:rPr>
+          <w:lang w:val="es-US"/>
+        </w:rPr>
+        <w:t>Construye el gráfico de codo sobre la base del clústeres con k=1 hasta k=40</w:t>
+      </w:r>
+    </w:p>
+    <w:p>
+      <w:pPr>
+        <w:pStyle w:val="Prrafodelista"/>
+        <w:numPr>
+          <w:ilvl w:val="0"/>
+          <w:numId w:val="3"/>
+        </w:numPr>
+        <w:rPr>
+          <w:lang w:val="es-US"/>
+        </w:rPr>
+      </w:pPr>
+      <w:r>
+        <w:rPr>
+          <w:lang w:val="es-US"/>
+        </w:rPr>
+        <w:t>Explicame que es un dendograma, también es necesario estandarizar?</w:t>
+      </w:r>
+    </w:p>
+    <w:p>
+      <w:pPr>
+        <w:pStyle w:val="Prrafodelista"/>
+        <w:numPr>
+          <w:ilvl w:val="0"/>
+          <w:numId w:val="3"/>
+        </w:numPr>
+        <w:rPr>
+          <w:lang w:val="es-US"/>
+        </w:rPr>
+      </w:pPr>
+      <w:r>
+        <w:rPr>
+          <w:lang w:val="es-US"/>
+        </w:rPr>
+        <w:t>De acuerdo, sobre las variables que aplicadas en el clúster k=2 y el gráfico de codo, apliquemos el dendograma</w:t>
+      </w:r>
+    </w:p>
+    <w:p>
+      <w:pPr>
+        <w:pStyle w:val="Prrafodelista"/>
+        <w:numPr>
+          <w:ilvl w:val="0"/>
+          <w:numId w:val="3"/>
+        </w:numPr>
+        <w:rPr>
+          <w:lang w:val="es-US"/>
+        </w:rPr>
+      </w:pPr>
+      <w:r>
+        <w:rPr>
+          <w:lang w:val="es-US"/>
+        </w:rPr>
+        <w:t>Entiendo que si el agrupamiento de 2 cluster es más alto, significa que el algoritmo recomienda un k=2, en este caso veo que seria entre 4 y 5 aprox (mira la imagen cargada), te parece que es correcta esa interpretación?</w:t>
+      </w:r>
+    </w:p>
+    <w:p>
+      <w:pPr>
+        <w:pStyle w:val="Prrafodelista"/>
+        <w:numPr>
+          <w:ilvl w:val="0"/>
+          <w:numId w:val="3"/>
+        </w:numPr>
+        <w:rPr>
+          <w:lang w:val="es-US"/>
+        </w:rPr>
+      </w:pPr>
+      <w:r>
+        <w:rPr>
+          <w:lang w:val="es-US"/>
+        </w:rPr>
+        <w:t>En que se diferencia el dendograma como lo que venimos trabajando?</w:t>
+      </w:r>
+    </w:p>
+    <w:p>
+      <w:pPr>
+        <w:pStyle w:val="Prrafodelista"/>
+        <w:numPr>
+          <w:ilvl w:val="0"/>
+          <w:numId w:val="3"/>
+        </w:numPr>
+        <w:rPr>
+          <w:lang w:val="es-US"/>
+        </w:rPr>
+      </w:pPr>
+      <w:r>
+        <w:rPr>
+          <w:lang w:val="es-US"/>
+        </w:rPr>
+        <w:t>Es correcto que usemos menos muestra que en K-medias?</w:t>
+      </w:r>
+    </w:p>
+    <w:p>
+      <w:pPr>
+        <w:pStyle w:val="Prrafodelista"/>
+        <w:numPr>
+          <w:ilvl w:val="0"/>
+          <w:numId w:val="3"/>
+        </w:numPr>
+        <w:rPr>
+          <w:lang w:val="es-US"/>
+        </w:rPr>
+      </w:pPr>
+      <w:r>
+        <w:rPr>
+          <w:lang w:val="es-US"/>
+        </w:rPr>
+        <w:t>Existe ganancia adicional en usar mayor muestra?</w:t>
+      </w:r>
+    </w:p>
+    <w:p>
+      <w:pPr>
+        <w:pStyle w:val="Prrafodelista"/>
+        <w:numPr>
+          <w:ilvl w:val="0"/>
+          <w:numId w:val="3"/>
+        </w:numPr>
+        <w:rPr>
+          <w:lang w:val="es-US"/>
+        </w:rPr>
+      </w:pPr>
+      <w:r>
+        <w:rPr>
+          <w:lang w:val="es-US"/>
+        </w:rPr>
+        <w:t>Perfecto, ahora pasemos al método de k-modas, la aplicación será a partir de variables categóricas y numéricas, entonces primero necesito identificar de forma clara todas las variables de la base, para ello te coloco los resultado del ocupados.info() pero además necesito que me pases un código más legible para ver todas las variables por categoría de formas más ordenada</w:t>
+      </w:r>
+    </w:p>
+    <w:p>
+      <w:pPr>
+        <w:pStyle w:val="Prrafodelista"/>
+        <w:numPr>
+          <w:ilvl w:val="0"/>
+          <w:numId w:val="3"/>
+        </w:numPr>
+        <w:rPr>
+          <w:lang w:val="es-US"/>
+        </w:rPr>
+      </w:pPr>
+      <w:r>
+        <w:rPr>
+          <w:lang w:val="es-US"/>
+        </w:rPr>
+        <w:t>Perfecto, estos son los resultados, aquí podrás ver las variables y su respectivo tipo. Muchas de las variables son categóricas, es necesario que las que tienen más de 1 nivel se conviertan en dummy?</w:t>
+      </w:r>
+    </w:p>
+    <w:p>
+      <w:pPr>
+        <w:pStyle w:val="Prrafodelista"/>
+        <w:numPr>
+          <w:ilvl w:val="0"/>
+          <w:numId w:val="3"/>
+        </w:numPr>
+        <w:rPr>
+          <w:lang w:val="es-US"/>
+        </w:rPr>
+      </w:pPr>
+      <w:r>
+        <w:rPr>
+          <w:lang w:val="es-US"/>
+        </w:rPr>
+        <w:t>Que es la distancia de Hamming?</w:t>
+      </w:r>
+    </w:p>
+    <w:p>
+      <w:pPr>
+        <w:pStyle w:val="Prrafodelista"/>
+        <w:numPr>
+          <w:ilvl w:val="0"/>
+          <w:numId w:val="3"/>
+        </w:numPr>
+        <w:rPr>
+          <w:lang w:val="es-US"/>
+        </w:rPr>
+      </w:pPr>
+      <w:r>
+        <w:rPr>
+          <w:lang w:val="es-US"/>
+        </w:rPr>
+        <w:t>Perfecto entonces pasemos a la aplicación,</w:t>
+      </w:r>
+    </w:p>
+    <w:p>
+      <w:pPr>
+        <w:pStyle w:val="Prrafodelista"/>
+        <w:numPr>
+          <w:ilvl w:val="0"/>
+          <w:numId w:val="3"/>
+        </w:numPr>
+        <w:rPr>
+          <w:lang w:val="es-US"/>
+        </w:rPr>
+      </w:pPr>
+      <w:r>
+        <w:rPr>
+          <w:lang w:val="es-US"/>
+        </w:rPr>
+        <w:t>Pasemos al método del codo, análogo a lo hecho en k-medias</w:t>
+      </w:r>
+    </w:p>
+    <w:p>
+      <w:pPr>
+        <w:pStyle w:val="Prrafodelista"/>
+        <w:numPr>
+          <w:ilvl w:val="0"/>
+          <w:numId w:val="3"/>
+        </w:numPr>
+        <w:rPr>
+          <w:lang w:val="es-US"/>
+        </w:rPr>
+      </w:pPr>
+      <w:r>
+        <w:rPr>
+          <w:lang w:val="es-US"/>
+        </w:rPr>
+        <w:t>Podrías comparar los métodos de codo hecho en k medias y k modas, estos son los códigos aplicados</w:t>
       </w:r>
     </w:p>
     <w:p>
@@ -3465,6 +3611,119 @@
 <file path=word/numbering.xml><?xml version="1.0" encoding="utf-8"?>
 <w:numbering xmlns:wpc="http://schemas.microsoft.com/office/word/2010/wordprocessingCanvas" xmlns:cx="http://schemas.microsoft.com/office/drawing/2014/chartex" xmlns:cx1="http://schemas.microsoft.com/office/drawing/2015/9/8/chartex" xmlns:cx2="http://schemas.microsoft.com/office/drawing/2015/10/21/chartex" xmlns:cx3="http://schemas.microsoft.com/office/drawing/2016/5/9/chartex" xmlns:cx4="http://schemas.microsoft.com/office/drawing/2016/5/10/chartex" xmlns:cx5="http://schemas.microsoft.com/office/drawing/2016/5/11/chartex" xmlns:cx6="http://schemas.microsoft.com/office/drawing/2016/5/12/chartex" xmlns:cx7="http://schemas.microsoft.com/office/drawing/2016/5/13/chartex" xmlns:cx8="http://schemas.microsoft.com/office/drawing/2016/5/14/chartex" xmlns:mc="http://schemas.openxmlformats.org/markup-compatibility/2006" xmlns:aink="http://schemas.microsoft.com/office/drawing/2016/ink" xmlns:am3d="http://schemas.microsoft.com/office/drawing/2017/model3d" xmlns:o="urn:schemas-microsoft-com:office:office" xmlns:r="http://schemas.openxmlformats.org/officeDocument/2006/relationships" xmlns:m="http://schemas.openxmlformats.org/officeDocument/2006/math" xmlns:v="urn:schemas-microsoft-com:vml" xmlns:wp14="http://schemas.microsoft.com/office/word/2010/wordprocessingDrawing" xmlns:wp="http://schemas.openxmlformats.org/drawingml/2006/wordprocessingDrawing" xmlns:w10="urn:schemas-microsoft-com:office:word" xmlns:w="http://schemas.openxmlformats.org/wordprocessingml/2006/main" xmlns:w14="http://schemas.microsoft.com/office/word/2010/wordml" xmlns:w15="http://schemas.microsoft.com/office/word/2012/wordml" xmlns:w16cex="http://schemas.microsoft.com/office/word/2018/wordml/cex" xmlns:w16cid="http://schemas.microsoft.com/office/word/2016/wordml/cid" xmlns:w16="http://schemas.microsoft.com/office/word/2018/wordml" xmlns:w16sdtdh="http://schemas.microsoft.com/office/word/2020/wordml/sdtdatahash" xmlns:w16se="http://schemas.microsoft.com/office/word/2015/wordml/symex" xmlns:wpg="http://schemas.microsoft.com/office/word/2010/wordprocessingGroup" xmlns:wpi="http://schemas.microsoft.com/office/word/2010/wordprocessingInk" xmlns:wne="http://schemas.microsoft.com/office/word/2006/wordml" xmlns:wps="http://schemas.microsoft.com/office/word/2010/wordprocessingShape" mc:Ignorable="w14 w15 w16se w16cid w16 w16cex w16sdtdh wp14">
   <w:abstractNum w:abstractNumId="0" w15:restartNumberingAfterBreak="0">
+    <w:nsid w:val="07EF9ED1"/>
+    <w:multiLevelType w:val="hybridMultilevel"/>
+    <w:tmpl w:val="A44680D6"/>
+    <w:lvl w:ilvl="0" w:tplc="2884D3B8">
+      <w:start w:val="1"/>
+      <w:numFmt w:val="bullet"/>
+      <w:lvlText w:val=""/>
+      <w:lvlJc w:val="left"/>
+      <w:pPr>
+        <w:ind w:left="720" w:hanging="360"/>
+      </w:pPr>
+      <w:rPr>
+        <w:rFonts w:ascii="Symbol" w:hAnsi="Symbol" w:hint="default"/>
+      </w:rPr>
+    </w:lvl>
+    <w:lvl w:ilvl="1" w:tplc="F814E180">
+      <w:start w:val="1"/>
+      <w:numFmt w:val="bullet"/>
+      <w:lvlText w:val="o"/>
+      <w:lvlJc w:val="left"/>
+      <w:pPr>
+        <w:ind w:left="1440" w:hanging="360"/>
+      </w:pPr>
+      <w:rPr>
+        <w:rFonts w:ascii="Courier New" w:hAnsi="Courier New" w:hint="default"/>
+      </w:rPr>
+    </w:lvl>
+    <w:lvl w:ilvl="2" w:tplc="697E6EA4">
+      <w:start w:val="1"/>
+      <w:numFmt w:val="bullet"/>
+      <w:lvlText w:val=""/>
+      <w:lvlJc w:val="left"/>
+      <w:pPr>
+        <w:ind w:left="2160" w:hanging="360"/>
+      </w:pPr>
+      <w:rPr>
+        <w:rFonts w:ascii="Wingdings" w:hAnsi="Wingdings" w:hint="default"/>
+      </w:rPr>
+    </w:lvl>
+    <w:lvl w:ilvl="3" w:tplc="F05ED692">
+      <w:start w:val="1"/>
+      <w:numFmt w:val="bullet"/>
+      <w:lvlText w:val=""/>
+      <w:lvlJc w:val="left"/>
+      <w:pPr>
+        <w:ind w:left="2880" w:hanging="360"/>
+      </w:pPr>
+      <w:rPr>
+        <w:rFonts w:ascii="Symbol" w:hAnsi="Symbol" w:hint="default"/>
+      </w:rPr>
+    </w:lvl>
+    <w:lvl w:ilvl="4" w:tplc="25F0C988">
+      <w:start w:val="1"/>
+      <w:numFmt w:val="bullet"/>
+      <w:lvlText w:val="o"/>
+      <w:lvlJc w:val="left"/>
+      <w:pPr>
+        <w:ind w:left="3600" w:hanging="360"/>
+      </w:pPr>
+      <w:rPr>
+        <w:rFonts w:ascii="Courier New" w:hAnsi="Courier New" w:hint="default"/>
+      </w:rPr>
+    </w:lvl>
+    <w:lvl w:ilvl="5" w:tplc="E14CD7B0">
+      <w:start w:val="1"/>
+      <w:numFmt w:val="bullet"/>
+      <w:lvlText w:val=""/>
+      <w:lvlJc w:val="left"/>
+      <w:pPr>
+        <w:ind w:left="4320" w:hanging="360"/>
+      </w:pPr>
+      <w:rPr>
+        <w:rFonts w:ascii="Wingdings" w:hAnsi="Wingdings" w:hint="default"/>
+      </w:rPr>
+    </w:lvl>
+    <w:lvl w:ilvl="6" w:tplc="F9BC38EA">
+      <w:start w:val="1"/>
+      <w:numFmt w:val="bullet"/>
+      <w:lvlText w:val=""/>
+      <w:lvlJc w:val="left"/>
+      <w:pPr>
+        <w:ind w:left="5040" w:hanging="360"/>
+      </w:pPr>
+      <w:rPr>
+        <w:rFonts w:ascii="Symbol" w:hAnsi="Symbol" w:hint="default"/>
+      </w:rPr>
+    </w:lvl>
+    <w:lvl w:ilvl="7" w:tplc="B4D25F32">
+      <w:start w:val="1"/>
+      <w:numFmt w:val="bullet"/>
+      <w:lvlText w:val="o"/>
+      <w:lvlJc w:val="left"/>
+      <w:pPr>
+        <w:ind w:left="5760" w:hanging="360"/>
+      </w:pPr>
+      <w:rPr>
+        <w:rFonts w:ascii="Courier New" w:hAnsi="Courier New" w:hint="default"/>
+      </w:rPr>
+    </w:lvl>
+    <w:lvl w:ilvl="8" w:tplc="64D6F81A">
+      <w:start w:val="1"/>
+      <w:numFmt w:val="bullet"/>
+      <w:lvlText w:val=""/>
+      <w:lvlJc w:val="left"/>
+      <w:pPr>
+        <w:ind w:left="6480" w:hanging="360"/>
+      </w:pPr>
+      <w:rPr>
+        <w:rFonts w:ascii="Wingdings" w:hAnsi="Wingdings" w:hint="default"/>
+      </w:rPr>
+    </w:lvl>
+  </w:abstractNum>
+  <w:abstractNum w:abstractNumId="1" w15:restartNumberingAfterBreak="0">
     <w:nsid w:val="1CBD471C"/>
     <w:multiLevelType w:val="hybridMultilevel"/>
     <w:tmpl w:val="DE90EB28"/>
@@ -3577,7 +3836,7 @@
       </w:rPr>
     </w:lvl>
   </w:abstractNum>
-  <w:abstractNum w:abstractNumId="1" w15:restartNumberingAfterBreak="0">
+  <w:abstractNum w:abstractNumId="2" w15:restartNumberingAfterBreak="0">
     <w:nsid w:val="28F57FB3"/>
     <w:multiLevelType w:val="multilevel"/>
     <w:tmpl w:val="74FA1804"/>
@@ -3693,7 +3952,7 @@
       </w:rPr>
     </w:lvl>
   </w:abstractNum>
-  <w:abstractNum w:abstractNumId="2" w15:restartNumberingAfterBreak="0">
+  <w:abstractNum w:abstractNumId="3" w15:restartNumberingAfterBreak="0">
     <w:nsid w:val="76BB2616"/>
     <w:multiLevelType w:val="multilevel"/>
     <w:tmpl w:val="280A001F"/>
@@ -3780,13 +4039,22 @@
     </w:lvl>
   </w:abstractNum>
   <w:num w:numId="1">
+    <w:abstractNumId w:val="2"/>
+  </w:num>
+  <w:num w:numId="2">
+    <w:abstractNumId w:val="3"/>
+  </w:num>
+  <w:num w:numId="3">
     <w:abstractNumId w:val="1"/>
   </w:num>
-  <w:num w:numId="2">
+  <w:num w:numId="4">
+    <w:abstractNumId w:val="0"/>
+  </w:num>
+  <w:num w:numId="5">
     <w:abstractNumId w:val="2"/>
   </w:num>
-  <w:num w:numId="3">
-    <w:abstractNumId w:val="0"/>
+  <w:num w:numId="6">
+    <w:abstractNumId w:val="2"/>
   </w:num>
   <w:numIdMacAtCleanup w:val="3"/>
 </w:numbering>
@@ -5401,10 +5669,10 @@
 
 <file path=word/glossary/fontTable.xml><?xml version="1.0" encoding="utf-8"?>
 <w:fonts xmlns:mc="http://schemas.openxmlformats.org/markup-compatibility/2006" xmlns:r="http://schemas.openxmlformats.org/officeDocument/2006/relationships" xmlns:w="http://schemas.openxmlformats.org/wordprocessingml/2006/main" xmlns:w14="http://schemas.microsoft.com/office/word/2010/wordml" xmlns:w15="http://schemas.microsoft.com/office/word/2012/wordml" xmlns:w16cex="http://schemas.microsoft.com/office/word/2018/wordml/cex" xmlns:w16cid="http://schemas.microsoft.com/office/word/2016/wordml/cid" xmlns:w16="http://schemas.microsoft.com/office/word/2018/wordml" xmlns:w16sdtdh="http://schemas.microsoft.com/office/word/2020/wordml/sdtdatahash" xmlns:w16se="http://schemas.microsoft.com/office/word/2015/wordml/symex" mc:Ignorable="w14 w15 w16se w16cid w16 w16cex w16sdtdh">
-  <w:font w:name="Wingdings">
-    <w:panose1 w:val="05000000000000000000"/>
+  <w:font w:name="Symbol">
+    <w:panose1 w:val="05050102010706020507"/>
     <w:charset w:val="02"/>
-    <w:family w:val="auto"/>
+    <w:family w:val="roman"/>
     <w:pitch w:val="variable"/>
     <w:sig w:usb0="00000000" w:usb1="10000000" w:usb2="00000000" w:usb3="00000000" w:csb0="80000000" w:csb1="00000000"/>
   </w:font>
@@ -5422,10 +5690,10 @@
     <w:pitch w:val="fixed"/>
     <w:sig w:usb0="E0002EFF" w:usb1="C0007843" w:usb2="00000009" w:usb3="00000000" w:csb0="000001FF" w:csb1="00000000"/>
   </w:font>
-  <w:font w:name="Symbol">
-    <w:panose1 w:val="05050102010706020507"/>
+  <w:font w:name="Wingdings">
+    <w:panose1 w:val="05000000000000000000"/>
     <w:charset w:val="02"/>
-    <w:family w:val="roman"/>
+    <w:family w:val="auto"/>
     <w:pitch w:val="variable"/>
     <w:sig w:usb0="00000000" w:usb1="10000000" w:usb2="00000000" w:usb3="00000000" w:csb0="80000000" w:csb1="00000000"/>
   </w:font>
@@ -5515,6 +5783,7 @@
     <w:rsid w:val="00DA4981"/>
     <w:rsid w:val="00E36221"/>
     <w:rsid w:val="00E877D6"/>
+    <w:rsid w:val="00EC47B7"/>
     <w:rsid w:val="00F07D25"/>
     <w:rsid w:val="00FB4D52"/>
   </w:rsids>
@@ -6366,6 +6635,15 @@
 </file>
 
 <file path=customXml/item1.xml><?xml version="1.0" encoding="utf-8"?>
+<p:properties xmlns:p="http://schemas.microsoft.com/office/2006/metadata/properties" xmlns:xsi="http://www.w3.org/2001/XMLSchema-instance" xmlns:pc="http://schemas.microsoft.com/office/infopath/2007/PartnerControls">
+  <documentManagement>
+    <Nro xmlns="e62bc30b-b884-4ee1-b0ab-e2e35dfacfd5">0</Nro>
+    <Unidad xmlns="e62bc30b-b884-4ee1-b0ab-e2e35dfacfd5" xsi:nil="true"/>
+  </documentManagement>
+</p:properties>
+</file>
+
+<file path=customXml/item2.xml><?xml version="1.0" encoding="utf-8"?>
 <ct:contentTypeSchema xmlns:ct="http://schemas.microsoft.com/office/2006/metadata/contentType" xmlns:ma="http://schemas.microsoft.com/office/2006/metadata/properties/metaAttributes" ct:_="" ma:_="" ma:contentTypeName="Documento" ma:contentTypeID="0x01010006ACA7DB3593B24E887290A71F51A18F" ma:contentTypeVersion="10" ma:contentTypeDescription="Crear nuevo documento." ma:contentTypeScope="" ma:versionID="5fde8b866a40f115df17144418c3774a">
   <xsd:schema xmlns:xsd="http://www.w3.org/2001/XMLSchema" xmlns:xs="http://www.w3.org/2001/XMLSchema" xmlns:p="http://schemas.microsoft.com/office/2006/metadata/properties" xmlns:ns2="e62bc30b-b884-4ee1-b0ab-e2e35dfacfd5" targetNamespace="http://schemas.microsoft.com/office/2006/metadata/properties" ma:root="true" ma:fieldsID="722d0d74b5f1a0e9a135ab2398c17b72" ns2:_="">
     <xsd:import namespace="e62bc30b-b884-4ee1-b0ab-e2e35dfacfd5"/>
@@ -6545,16 +6823,11 @@
 </ct:contentTypeSchema>
 </file>
 
-<file path=customXml/item2.xml><?xml version="1.0" encoding="utf-8"?>
-<p:properties xmlns:p="http://schemas.microsoft.com/office/2006/metadata/properties" xmlns:xsi="http://www.w3.org/2001/XMLSchema-instance" xmlns:pc="http://schemas.microsoft.com/office/infopath/2007/PartnerControls">
-  <documentManagement>
-    <Nro xmlns="e62bc30b-b884-4ee1-b0ab-e2e35dfacfd5">0</Nro>
-    <Unidad xmlns="e62bc30b-b884-4ee1-b0ab-e2e35dfacfd5" xsi:nil="true"/>
-  </documentManagement>
-</p:properties>
+<file path=customXml/item3.xml><?xml version="1.0" encoding="utf-8"?>
+<b:Sources xmlns:b="http://schemas.openxmlformats.org/officeDocument/2006/bibliography" xmlns="http://schemas.openxmlformats.org/officeDocument/2006/bibliography" SelectedStyle="/APASixthEditionOfficeOnline.xsl" StyleName="APA" Version="6"/>
 </file>
 
-<file path=customXml/item3.xml><?xml version="1.0" encoding="utf-8"?>
+<file path=customXml/item4.xml><?xml version="1.0" encoding="utf-8"?>
 <?mso-contentType ?>
 <FormTemplates xmlns="http://schemas.microsoft.com/sharepoint/v3/contenttype/forms">
   <Display>DocumentLibraryForm</Display>
@@ -6563,11 +6836,17 @@
 </FormTemplates>
 </file>
 
-<file path=customXml/item4.xml><?xml version="1.0" encoding="utf-8"?>
-<b:Sources xmlns:b="http://schemas.openxmlformats.org/officeDocument/2006/bibliography" xmlns="http://schemas.openxmlformats.org/officeDocument/2006/bibliography" SelectedStyle="/APASixthEditionOfficeOnline.xsl" StyleName="APA" Version="6"/>
+<file path=customXml/itemProps1.xml><?xml version="1.0" encoding="utf-8"?>
+<ds:datastoreItem xmlns:ds="http://schemas.openxmlformats.org/officeDocument/2006/customXml" ds:itemID="{DAAF528F-7240-408A-9BF0-E37AC9702D32}">
+  <ds:schemaRefs>
+    <ds:schemaRef ds:uri="http://schemas.microsoft.com/office/2006/metadata/properties"/>
+    <ds:schemaRef ds:uri="http://schemas.microsoft.com/office/infopath/2007/PartnerControls"/>
+    <ds:schemaRef ds:uri="e62bc30b-b884-4ee1-b0ab-e2e35dfacfd5"/>
+  </ds:schemaRefs>
+</ds:datastoreItem>
 </file>
 
-<file path=customXml/itemProps1.xml><?xml version="1.0" encoding="utf-8"?>
+<file path=customXml/itemProps2.xml><?xml version="1.0" encoding="utf-8"?>
 <ds:datastoreItem xmlns:ds="http://schemas.openxmlformats.org/officeDocument/2006/customXml" ds:itemID="{BB19413B-A659-4239-B251-6BE967D5DACB}">
   <ds:schemaRefs>
     <ds:schemaRef ds:uri="http://schemas.microsoft.com/office/2006/metadata/contentType"/>
@@ -6585,28 +6864,18 @@
 </ds:datastoreItem>
 </file>
 
-<file path=customXml/itemProps2.xml><?xml version="1.0" encoding="utf-8"?>
-<ds:datastoreItem xmlns:ds="http://schemas.openxmlformats.org/officeDocument/2006/customXml" ds:itemID="{DAAF528F-7240-408A-9BF0-E37AC9702D32}">
+<file path=customXml/itemProps3.xml><?xml version="1.0" encoding="utf-8"?>
+<ds:datastoreItem xmlns:ds="http://schemas.openxmlformats.org/officeDocument/2006/customXml" ds:itemID="{BE0E3CBB-9640-C643-97A5-411B9F838128}">
   <ds:schemaRefs>
-    <ds:schemaRef ds:uri="http://schemas.microsoft.com/office/2006/metadata/properties"/>
-    <ds:schemaRef ds:uri="http://schemas.microsoft.com/office/infopath/2007/PartnerControls"/>
-    <ds:schemaRef ds:uri="e62bc30b-b884-4ee1-b0ab-e2e35dfacfd5"/>
+    <ds:schemaRef ds:uri="http://schemas.openxmlformats.org/officeDocument/2006/bibliography"/>
   </ds:schemaRefs>
 </ds:datastoreItem>
 </file>
 
-<file path=customXml/itemProps3.xml><?xml version="1.0" encoding="utf-8"?>
+<file path=customXml/itemProps4.xml><?xml version="1.0" encoding="utf-8"?>
 <ds:datastoreItem xmlns:ds="http://schemas.openxmlformats.org/officeDocument/2006/customXml" ds:itemID="{7E3075BF-FDAF-4D4D-8DC1-23126609A178}">
   <ds:schemaRefs>
     <ds:schemaRef ds:uri="http://schemas.microsoft.com/sharepoint/v3/contenttype/forms"/>
   </ds:schemaRefs>
 </ds:datastoreItem>
-</file>
-
-<file path=customXml/itemProps4.xml><?xml version="1.0" encoding="utf-8"?>
-<ds:datastoreItem xmlns:ds="http://schemas.openxmlformats.org/officeDocument/2006/customXml" ds:itemID="{BE0E3CBB-9640-C643-97A5-411B9F838128}">
-  <ds:schemaRefs>
-    <ds:schemaRef ds:uri="http://schemas.openxmlformats.org/officeDocument/2006/bibliography"/>
-  </ds:schemaRefs>
-</ds:datastoreItem>
 </file>
</xml_diff>

<commit_message>
Creación del formato de diapositivas para la exposición
</commit_message>
<xml_diff>
--- a/TP2/TP2_Programacion_Grupo3.docx
+++ b/TP2/TP2_Programacion_Grupo3.docx
@@ -6255,6 +6255,9 @@
         <w:fldChar w:fldCharType="separate"/>
       </w:r>
       <w:r>
+        <w:rPr>
+          <w:noProof/>
+        </w:rPr>
         <w:t>3</w:t>
       </w:r>
       <w:r>
@@ -21718,6 +21721,9 @@
         <w:fldChar w:fldCharType="separate"/>
       </w:r>
       <w:r>
+        <w:rPr>
+          <w:noProof/>
+        </w:rPr>
         <w:t>6</w:t>
       </w:r>
       <w:r>
@@ -24997,6 +25003,7 @@
     <w:rsid w:val="00052680"/>
     <w:rsid w:val="000745AB"/>
     <w:rsid w:val="001C47A7"/>
+    <w:rsid w:val="003021D5"/>
     <w:rsid w:val="00372C2A"/>
     <w:rsid w:val="00383DB1"/>
     <w:rsid w:val="003C24C9"/>
@@ -25018,7 +25025,6 @@
     <w:rsid w:val="00AF2C96"/>
     <w:rsid w:val="00D348EA"/>
     <w:rsid w:val="00DA4981"/>
-    <w:rsid w:val="00DF3F4D"/>
     <w:rsid w:val="00E36221"/>
     <w:rsid w:val="00E877D6"/>
     <w:rsid w:val="00EC47B7"/>

</xml_diff>

<commit_message>
Se incorporó partes B2 y C tanto en el código como el informe
</commit_message>
<xml_diff>
--- a/TP2/TP2_Programacion_Grupo3.docx
+++ b/TP2/TP2_Programacion_Grupo3.docx
@@ -1,6 +1,6 @@
 
 <file path=word/document.xml><?xml version="1.0" encoding="utf-8"?>
-<w:document xmlns:wpc="http://schemas.microsoft.com/office/word/2010/wordprocessingCanvas" xmlns:cx="http://schemas.microsoft.com/office/drawing/2014/chartex" xmlns:cx1="http://schemas.microsoft.com/office/drawing/2015/9/8/chartex" xmlns:cx2="http://schemas.microsoft.com/office/drawing/2015/10/21/chartex" xmlns:cx3="http://schemas.microsoft.com/office/drawing/2016/5/9/chartex" xmlns:cx4="http://schemas.microsoft.com/office/drawing/2016/5/10/chartex" xmlns:cx5="http://schemas.microsoft.com/office/drawing/2016/5/11/chartex" xmlns:cx6="http://schemas.microsoft.com/office/drawing/2016/5/12/chartex" xmlns:cx7="http://schemas.microsoft.com/office/drawing/2016/5/13/chartex" xmlns:cx8="http://schemas.microsoft.com/office/drawing/2016/5/14/chartex" xmlns:mc="http://schemas.openxmlformats.org/markup-compatibility/2006" xmlns:aink="http://schemas.microsoft.com/office/drawing/2016/ink" xmlns:am3d="http://schemas.microsoft.com/office/drawing/2017/model3d" xmlns:o="urn:schemas-microsoft-com:office:office" xmlns:oel="http://schemas.microsoft.com/office/2019/extlst" xmlns:r="http://schemas.openxmlformats.org/officeDocument/2006/relationships" xmlns:m="http://schemas.openxmlformats.org/officeDocument/2006/math" xmlns:v="urn:schemas-microsoft-com:vml" xmlns:wp14="http://schemas.microsoft.com/office/word/2010/wordprocessingDrawing" xmlns:wp="http://schemas.openxmlformats.org/drawingml/2006/wordprocessingDrawing" xmlns:w10="urn:schemas-microsoft-com:office:word" xmlns:w="http://schemas.openxmlformats.org/wordprocessingml/2006/main" xmlns:w14="http://schemas.microsoft.com/office/word/2010/wordml" xmlns:w15="http://schemas.microsoft.com/office/word/2012/wordml" xmlns:w16cex="http://schemas.microsoft.com/office/word/2018/wordml/cex" xmlns:w16cid="http://schemas.microsoft.com/office/word/2016/wordml/cid" xmlns:w16="http://schemas.microsoft.com/office/word/2018/wordml" xmlns:w16du="http://schemas.microsoft.com/office/word/2023/wordml/word16du" xmlns:w16sdtdh="http://schemas.microsoft.com/office/word/2020/wordml/sdtdatahash" xmlns:w16sdtfl="http://schemas.microsoft.com/office/word/2024/wordml/sdtformatlock" xmlns:w16se="http://schemas.microsoft.com/office/word/2015/wordml/symex" xmlns:wpg="http://schemas.microsoft.com/office/word/2010/wordprocessingGroup" xmlns:wpi="http://schemas.microsoft.com/office/word/2010/wordprocessingInk" xmlns:wne="http://schemas.microsoft.com/office/word/2006/wordml" xmlns:wps="http://schemas.microsoft.com/office/word/2010/wordprocessingShape" mc:Ignorable="w14 w15 w16se w16cid w16 w16cex w16sdtdh w16sdtfl w16du wp14">
+<w:document xmlns:wpc="http://schemas.microsoft.com/office/word/2010/wordprocessingCanvas" xmlns:cx="http://schemas.microsoft.com/office/drawing/2014/chartex" xmlns:cx1="http://schemas.microsoft.com/office/drawing/2015/9/8/chartex" xmlns:cx2="http://schemas.microsoft.com/office/drawing/2015/10/21/chartex" xmlns:cx3="http://schemas.microsoft.com/office/drawing/2016/5/9/chartex" xmlns:cx4="http://schemas.microsoft.com/office/drawing/2016/5/10/chartex" xmlns:cx5="http://schemas.microsoft.com/office/drawing/2016/5/11/chartex" xmlns:cx6="http://schemas.microsoft.com/office/drawing/2016/5/12/chartex" xmlns:cx7="http://schemas.microsoft.com/office/drawing/2016/5/13/chartex" xmlns:cx8="http://schemas.microsoft.com/office/drawing/2016/5/14/chartex" xmlns:mc="http://schemas.openxmlformats.org/markup-compatibility/2006" xmlns:aink="http://schemas.microsoft.com/office/drawing/2016/ink" xmlns:am3d="http://schemas.microsoft.com/office/drawing/2017/model3d" xmlns:o="urn:schemas-microsoft-com:office:office" xmlns:r="http://schemas.openxmlformats.org/officeDocument/2006/relationships" xmlns:m="http://schemas.openxmlformats.org/officeDocument/2006/math" xmlns:v="urn:schemas-microsoft-com:vml" xmlns:wp14="http://schemas.microsoft.com/office/word/2010/wordprocessingDrawing" xmlns:wp="http://schemas.openxmlformats.org/drawingml/2006/wordprocessingDrawing" xmlns:w10="urn:schemas-microsoft-com:office:word" xmlns:w="http://schemas.openxmlformats.org/wordprocessingml/2006/main" xmlns:w14="http://schemas.microsoft.com/office/word/2010/wordml" xmlns:w15="http://schemas.microsoft.com/office/word/2012/wordml" xmlns:w16cex="http://schemas.microsoft.com/office/word/2018/wordml/cex" xmlns:w16cid="http://schemas.microsoft.com/office/word/2016/wordml/cid" xmlns:w16="http://schemas.microsoft.com/office/word/2018/wordml" xmlns:w16sdtdh="http://schemas.microsoft.com/office/word/2020/wordml/sdtdatahash" xmlns:w16se="http://schemas.microsoft.com/office/word/2015/wordml/symex" xmlns:wpg="http://schemas.microsoft.com/office/word/2010/wordprocessingGroup" xmlns:wpi="http://schemas.microsoft.com/office/word/2010/wordprocessingInk" xmlns:wne="http://schemas.microsoft.com/office/word/2006/wordml" xmlns:wps="http://schemas.microsoft.com/office/word/2010/wordprocessingShape" mc:Ignorable="w14 w15 w16se w16cid w16 w16cex w16sdtdh wp14">
   <w:body>
     <w:p>
       <w:pPr>
@@ -386,7 +386,6 @@
           <w:lang w:val="es-ES_tradnl"/>
         </w:rPr>
       </w:pPr>
-      <w:proofErr w:type="spellStart"/>
       <w:r>
         <w:rPr>
           <w:rFonts w:cs="Times New Roman"/>
@@ -399,7 +398,6 @@
         </w:rPr>
         <w:t>Github</w:t>
       </w:r>
-      <w:proofErr w:type="spellEnd"/>
       <w:r>
         <w:rPr>
           <w:rFonts w:cs="Times New Roman"/>
@@ -846,7 +844,6 @@
         </w:rPr>
         <w:t xml:space="preserve">dos </w:t>
       </w:r>
-      <w:proofErr w:type="spellStart"/>
       <w:r>
         <w:rPr>
           <w:i/>
@@ -855,7 +852,6 @@
         </w:rPr>
         <w:t>heatmaps</w:t>
       </w:r>
-      <w:proofErr w:type="spellEnd"/>
       <w:r>
         <w:rPr>
           <w:lang w:val="es-US"/>
@@ -1737,27 +1733,7 @@
                 <w:szCs w:val="15"/>
                 <w:lang w:val="es-EC" w:eastAsia="es-MX"/>
               </w:rPr>
-              <w:t>Ingreso ocupaci</w:t>
-            </w:r>
-            <w:r>
-              <w:rPr>
-                <w:rFonts w:eastAsia="Times New Roman" w:cs="Times New Roman"/>
-                <w:color w:val="000000"/>
-                <w:sz w:val="15"/>
-                <w:szCs w:val="15"/>
-                <w:lang w:val="es-EC" w:eastAsia="es-MX"/>
-              </w:rPr>
-              <w:t>ó</w:t>
-            </w:r>
-            <w:r>
-              <w:rPr>
-                <w:rFonts w:eastAsia="Times New Roman" w:cs="Times New Roman"/>
-                <w:color w:val="000000"/>
-                <w:sz w:val="15"/>
-                <w:szCs w:val="15"/>
-                <w:lang w:val="es-EC" w:eastAsia="es-MX"/>
-              </w:rPr>
-              <w:t>n principal</w:t>
+              <w:t>Ingreso ocupación principal</w:t>
             </w:r>
           </w:p>
         </w:tc>
@@ -2771,27 +2747,7 @@
                 <w:szCs w:val="15"/>
                 <w:lang w:val="es-EC" w:eastAsia="es-MX"/>
               </w:rPr>
-              <w:t>Tama</w:t>
-            </w:r>
-            <w:r>
-              <w:rPr>
-                <w:rFonts w:eastAsia="Times New Roman" w:cs="Times New Roman"/>
-                <w:color w:val="000000"/>
-                <w:sz w:val="15"/>
-                <w:szCs w:val="15"/>
-                <w:lang w:val="es-EC" w:eastAsia="es-MX"/>
-              </w:rPr>
-              <w:t>ñ</w:t>
-            </w:r>
-            <w:r>
-              <w:rPr>
-                <w:rFonts w:eastAsia="Times New Roman" w:cs="Times New Roman"/>
-                <w:color w:val="000000"/>
-                <w:sz w:val="15"/>
-                <w:szCs w:val="15"/>
-                <w:lang w:val="es-EC" w:eastAsia="es-MX"/>
-              </w:rPr>
-              <w:t>o del establecimiento (codigo)</w:t>
+              <w:t>Tamaño del establecimiento (codigo)</w:t>
             </w:r>
           </w:p>
         </w:tc>
@@ -4825,6 +4781,7 @@
             <w:docPart w:val="81B7D8E0514EF54FBF78B0A4C2DE4AE6"/>
           </w:placeholder>
         </w:sdtPr>
+        <w:sdtEndPr/>
         <w:sdtContent>
           <w:r>
             <w:rPr>
@@ -5201,6 +5158,7 @@
             <w:docPart w:val="C162C43DA4D5B5499405923E2032ED9F"/>
           </w:placeholder>
         </w:sdtPr>
+        <w:sdtEndPr/>
         <w:sdtContent>
           <w:r>
             <w:rPr>
@@ -5246,43 +5204,19 @@
         <w:rPr>
           <w:lang w:val="es-US"/>
         </w:rPr>
-        <w:t xml:space="preserve">entre la edad y la edad al cuadrado es de 0,99 en 2024 y de 0,98 en 2025, lo que refleja la colinealidad esperada entre ellas, dado que </w:t>
+        <w:t>entre la edad y la edad al cuadrado es de 0,99 en 2024 y de 0,98 en 2025, lo que refleja la colinealidad esperada entre ellas, dado que ambas están construidas a partir de la misma variable.</w:t>
       </w:r>
       <w:r>
         <w:rPr>
           <w:lang w:val="es-US"/>
         </w:rPr>
-        <w:t xml:space="preserve">ambas </w:t>
+        <w:t xml:space="preserve"> Los predictores muestran correlaciones bajas con la informalidad: así, el tamaño del establecimiento presenta la correlación negativa más </w:t>
       </w:r>
       <w:r>
         <w:rPr>
           <w:lang w:val="es-US"/>
         </w:rPr>
-        <w:t xml:space="preserve">están construidas </w:t>
-      </w:r>
-      <w:r>
-        <w:rPr>
-          <w:lang w:val="es-US"/>
-        </w:rPr>
-        <w:t>a partir de la misma variable.</w:t>
-      </w:r>
-      <w:r>
-        <w:rPr>
-          <w:lang w:val="es-US"/>
-        </w:rPr>
-        <w:t xml:space="preserve"> Los predictores muestran correlaciones bajas con la informalidad: así, el tamaño del establecimiento presenta la correlación negativa más </w:t>
-      </w:r>
-      <w:r>
-        <w:rPr>
-          <w:lang w:val="es-US"/>
-        </w:rPr>
-        <w:t>fuerte,</w:t>
-      </w:r>
-      <w:r>
-        <w:rPr>
-          <w:lang w:val="es-US"/>
-        </w:rPr>
-        <w:t xml:space="preserve"> con valores de 0,35 y 0,33, respectivamente, seguido por el ingreso de la ocupación principal, con 0,25 y 0,22, y los años de educación,</w:t>
+        <w:t>fuerte, con valores de 0,35 y 0,33, respectivamente, seguido por el ingreso de la ocupación principal, con 0,25 y 0,22, y los años de educación,</w:t>
       </w:r>
       <w:r>
         <w:rPr>
@@ -5512,24 +5446,14 @@
         </w:rPr>
         <w:t xml:space="preserve"> de 2024 y 2025. Se analizan los scores del primer y del segundo componente diferenciando trabajadores formales e informales, se revisan los </w:t>
       </w:r>
-      <w:proofErr w:type="spellStart"/>
       <w:r>
         <w:rPr>
           <w:i/>
           <w:iCs/>
           <w:lang w:val="es-US"/>
         </w:rPr>
-        <w:t>loading</w:t>
-      </w:r>
-      <w:r>
-        <w:rPr>
-          <w:i/>
-          <w:iCs/>
-          <w:lang w:val="es-US"/>
-        </w:rPr>
-        <w:t>s</w:t>
-      </w:r>
-      <w:proofErr w:type="spellEnd"/>
+        <w:t>loadings</w:t>
+      </w:r>
       <w:r>
         <w:rPr>
           <w:lang w:val="es-US"/>
@@ -5588,27 +5512,7 @@
           <w:i/>
           <w:iCs w:val="0"/>
         </w:rPr>
-        <w:t xml:space="preserve">Scores de los dos primeros componentes principales y </w:t>
-      </w:r>
-      <w:proofErr w:type="spellStart"/>
-      <w:r>
-        <w:rPr>
-          <w:b w:val="0"/>
-          <w:bCs/>
-          <w:i/>
-          <w:iCs w:val="0"/>
-        </w:rPr>
-        <w:t>bitplot</w:t>
-      </w:r>
-      <w:proofErr w:type="spellEnd"/>
-      <w:r>
-        <w:rPr>
-          <w:b w:val="0"/>
-          <w:bCs/>
-          <w:i/>
-          <w:iCs w:val="0"/>
-        </w:rPr>
-        <w:t xml:space="preserve"> </w:t>
+        <w:t xml:space="preserve">Scores de los dos primeros componentes principales y bitplot </w:t>
       </w:r>
       <w:r>
         <w:rPr>
@@ -5630,6 +5534,7 @@
       </w:pPr>
       <w:r>
         <w:rPr>
+          <w:noProof/>
           <w:lang w:val="es-US"/>
         </w:rPr>
         <w:drawing>
@@ -5709,6 +5614,7 @@
             <w:docPart w:val="430E7E363142DE4E8D785F7BB9F20AB1"/>
           </w:placeholder>
         </w:sdtPr>
+        <w:sdtEndPr/>
         <w:sdtContent>
           <w:r>
             <w:rPr>
@@ -6187,6 +6093,7 @@
             <w:docPart w:val="DefaultPlaceholder_-1854013440"/>
           </w:placeholder>
         </w:sdtPr>
+        <w:sdtEndPr/>
         <w:sdtContent>
           <w:r>
             <w:rPr>
@@ -6289,6 +6196,7 @@
       </w:pPr>
       <w:r>
         <w:rPr>
+          <w:noProof/>
           <w:lang w:val="es-US"/>
         </w:rPr>
         <w:drawing>
@@ -6369,6 +6277,7 @@
             <w:docPart w:val="8124DC95D09D624DB1CFC77743F6472E"/>
           </w:placeholder>
         </w:sdtPr>
+        <w:sdtEndPr/>
         <w:sdtContent>
           <w:r>
             <w:rPr>
@@ -8560,7 +8469,6 @@
         </w:rPr>
         <w:t xml:space="preserve">Por una parte, se valora la contribución de la inteligencia artificial como herramienta de aprendizaje y programación, remarcando su utilidad para acceder rápidamente a la base de datos y, al mismo tiempo, para generar código que se interprete con claridad en Python, aunque se considera que el apoyo fue menos relevante en la fase interpretativa. A continuación, un registro de </w:t>
       </w:r>
-      <w:proofErr w:type="spellStart"/>
       <w:r>
         <w:rPr>
           <w:i/>
@@ -8569,7 +8477,6 @@
         </w:rPr>
         <w:t>prompts</w:t>
       </w:r>
-      <w:proofErr w:type="spellEnd"/>
       <w:r>
         <w:rPr>
           <w:szCs w:val="20"/>
@@ -8626,19 +8533,11 @@
           <w:lang w:val="es-US"/>
         </w:rPr>
       </w:pPr>
-      <w:proofErr w:type="spellStart"/>
       <w:r>
         <w:rPr>
           <w:lang w:val="es-US"/>
         </w:rPr>
-        <w:t>Prompts</w:t>
-      </w:r>
-      <w:proofErr w:type="spellEnd"/>
-      <w:r>
-        <w:rPr>
-          <w:lang w:val="es-US"/>
-        </w:rPr>
-        <w:t xml:space="preserve"> usados (Apéndice 1)</w:t>
+        <w:t>Prompts usados (Apéndice 1)</w:t>
       </w:r>
     </w:p>
     <w:p>
@@ -8683,67 +8582,19 @@
         <w:rPr>
           <w:szCs w:val="20"/>
         </w:rPr>
-        <w:t>a los otros costos de transacción propios del trabajo virtual, que</w:t>
+        <w:t xml:space="preserve">a los otros costos de transacción propios del trabajo virtual, que, afortunadamente, han </w:t>
       </w:r>
       <w:r>
         <w:rPr>
           <w:szCs w:val="20"/>
         </w:rPr>
-        <w:t>,</w:t>
+        <w:t>disminui</w:t>
       </w:r>
       <w:r>
         <w:rPr>
           <w:szCs w:val="20"/>
         </w:rPr>
-        <w:t xml:space="preserve"> afortunadamente</w:t>
-      </w:r>
-      <w:r>
-        <w:rPr>
-          <w:szCs w:val="20"/>
-        </w:rPr>
-        <w:t>,</w:t>
-      </w:r>
-      <w:r>
-        <w:rPr>
-          <w:szCs w:val="20"/>
-        </w:rPr>
-        <w:t xml:space="preserve"> han </w:t>
-      </w:r>
-      <w:r>
-        <w:rPr>
-          <w:szCs w:val="20"/>
-        </w:rPr>
-        <w:t>disminui</w:t>
-      </w:r>
-      <w:r>
-        <w:rPr>
-          <w:szCs w:val="20"/>
-        </w:rPr>
-        <w:t>do</w:t>
-      </w:r>
-      <w:r>
-        <w:rPr>
-          <w:szCs w:val="20"/>
-        </w:rPr>
-        <w:t>.</w:t>
-      </w:r>
-      <w:r>
-        <w:rPr>
-          <w:szCs w:val="20"/>
-        </w:rPr>
-        <w:t xml:space="preserve"> </w:t>
-      </w:r>
-      <w:r>
-        <w:rPr>
-          <w:szCs w:val="20"/>
-        </w:rPr>
-        <w:t>Además, ha permitido</w:t>
-      </w:r>
-      <w:r>
-        <w:rPr>
-          <w:szCs w:val="20"/>
-        </w:rPr>
-        <w:t xml:space="preserve"> la adecuación a nuevos </w:t>
+        <w:t xml:space="preserve">do. Además, ha permitido la adecuación a nuevos </w:t>
       </w:r>
       <w:r>
         <w:rPr>
@@ -8805,6 +8656,7 @@
           <w:docPart w:val="DefaultPlaceholder_-1854013440"/>
         </w:placeholder>
       </w:sdtPr>
+      <w:sdtEndPr/>
       <w:sdtContent>
         <w:p>
           <w:pPr>
@@ -8868,29 +8720,7 @@
               <w:color w:val="000000"/>
               <w:lang w:val="en-US"/>
             </w:rPr>
-            <w:t xml:space="preserve">Informality, </w:t>
-          </w:r>
-          <w:proofErr w:type="spellStart"/>
-          <w:r>
-            <w:rPr>
-              <w:rFonts w:eastAsia="Times New Roman" w:cs="Times New Roman"/>
-              <w:i/>
-              <w:iCs/>
-              <w:color w:val="000000"/>
-              <w:lang w:val="en-US"/>
-            </w:rPr>
-            <w:t>labour</w:t>
-          </w:r>
-          <w:proofErr w:type="spellEnd"/>
-          <w:r>
-            <w:rPr>
-              <w:rFonts w:eastAsia="Times New Roman" w:cs="Times New Roman"/>
-              <w:i/>
-              <w:iCs/>
-              <w:color w:val="000000"/>
-              <w:lang w:val="en-US"/>
-            </w:rPr>
-            <w:t xml:space="preserve"> transitions, and the livelihoods of workers in Latin America</w:t>
+            <w:t>Informality, labour transitions, and the livelihoods of workers in Latin America</w:t>
           </w:r>
           <w:r>
             <w:rPr>
@@ -8900,21 +8730,12 @@
             </w:rPr>
             <w:t xml:space="preserve"> (Vol. 2021). </w:t>
           </w:r>
-          <w:proofErr w:type="spellStart"/>
           <w:r>
             <w:rPr>
               <w:rFonts w:eastAsia="Times New Roman" w:cs="Times New Roman"/>
               <w:color w:val="000000"/>
             </w:rPr>
-            <w:t>United</w:t>
-          </w:r>
-          <w:proofErr w:type="spellEnd"/>
-          <w:r>
-            <w:rPr>
-              <w:rFonts w:eastAsia="Times New Roman" w:cs="Times New Roman"/>
-              <w:color w:val="000000"/>
-            </w:rPr>
-            <w:t xml:space="preserve"> Nations. https://doi.org/10.35188/UNU-WIDER/2021/953-2</w:t>
+            <w:t>United Nations. https://doi.org/10.35188/UNU-WIDER/2021/953-2</w:t>
           </w:r>
         </w:p>
         <w:p>
@@ -9015,6 +8836,15 @@
         </w:rPr>
         <w:t>Matriz de correlación entre las variables de interés del año 2024</w:t>
       </w:r>
+      <w:r>
+        <w:rPr>
+          <w:b w:val="0"/>
+          <w:bCs/>
+          <w:i/>
+          <w:iCs w:val="0"/>
+        </w:rPr>
+        <w:t>.</w:t>
+      </w:r>
     </w:p>
     <w:tbl>
       <w:tblPr>
@@ -9077,19 +8907,7 @@
                 <w:szCs w:val="11"/>
                 <w:lang w:val="es-EC" w:eastAsia="es-MX"/>
               </w:rPr>
-              <w:t> </w:t>
-            </w:r>
-            <w:r>
-              <w:rPr>
-                <w:rFonts w:eastAsia="Times New Roman" w:cs="Times New Roman"/>
-                <w:b/>
-                <w:bCs/>
-                <w:color w:val="000000"/>
-                <w:sz w:val="11"/>
-                <w:szCs w:val="11"/>
-                <w:lang w:val="es-EC" w:eastAsia="es-MX"/>
-              </w:rPr>
-              <w:t>Vriables</w:t>
+              <w:t> Vriables</w:t>
             </w:r>
           </w:p>
         </w:tc>
@@ -14904,6 +14722,7 @@
             <w:docPart w:val="3296E6E628D1E84B998AC23BFF9856BF"/>
           </w:placeholder>
         </w:sdtPr>
+        <w:sdtEndPr/>
         <w:sdtContent>
           <w:r>
             <w:rPr>
@@ -20850,6 +20669,7 @@
             <w:docPart w:val="2A55D88148E7B14189488E6B97BB644A"/>
           </w:placeholder>
         </w:sdtPr>
+        <w:sdtEndPr/>
         <w:sdtContent>
           <w:r>
             <w:rPr>
@@ -20924,6 +20744,7 @@
       </w:pPr>
       <w:r>
         <w:rPr>
+          <w:noProof/>
           <w:lang w:val="es-PE"/>
         </w:rPr>
         <w:drawing>
@@ -21010,6 +20831,7 @@
             <w:docPart w:val="36F491BB6B97D84E8D5AEA4B44A319D0"/>
           </w:placeholder>
         </w:sdtPr>
+        <w:sdtEndPr/>
         <w:sdtContent>
           <w:r>
             <w:rPr>
@@ -21071,27 +20893,7 @@
           <w:i/>
           <w:iCs w:val="0"/>
         </w:rPr>
-        <w:t>Método del (</w:t>
-      </w:r>
-      <w:proofErr w:type="spellStart"/>
-      <w:r>
-        <w:rPr>
-          <w:b w:val="0"/>
-          <w:bCs/>
-          <w:i/>
-          <w:iCs w:val="0"/>
-        </w:rPr>
-        <w:t>Elbow</w:t>
-      </w:r>
-      <w:proofErr w:type="spellEnd"/>
-      <w:r>
-        <w:rPr>
-          <w:b w:val="0"/>
-          <w:bCs/>
-          <w:i/>
-          <w:iCs w:val="0"/>
-        </w:rPr>
-        <w:t>) y su aplicación en el K-medias</w:t>
+        <w:t>Método del (Elbow) y su aplicación en el K-medias</w:t>
       </w:r>
     </w:p>
     <w:p>
@@ -21201,6 +21003,7 @@
             <w:docPart w:val="61CE31A3E3E8474F9DE2ADF1F630E4A8"/>
           </w:placeholder>
         </w:sdtPr>
+        <w:sdtEndPr/>
         <w:sdtContent>
           <w:r>
             <w:rPr>
@@ -21254,7 +21057,6 @@
       <w:r>
         <w:br/>
       </w:r>
-      <w:proofErr w:type="spellStart"/>
       <w:r>
         <w:rPr>
           <w:b w:val="0"/>
@@ -21262,17 +21064,7 @@
           <w:i/>
           <w:iCs w:val="0"/>
         </w:rPr>
-        <w:t>Dendrograma</w:t>
-      </w:r>
-      <w:proofErr w:type="spellEnd"/>
-      <w:r>
-        <w:rPr>
-          <w:b w:val="0"/>
-          <w:bCs/>
-          <w:i/>
-          <w:iCs w:val="0"/>
-        </w:rPr>
-        <w:t xml:space="preserve"> jerárquico</w:t>
+        <w:t>Dendrograma jerárquico</w:t>
       </w:r>
     </w:p>
     <w:p>
@@ -21374,6 +21166,7 @@
             <w:docPart w:val="C128CED313F7294CA88CB40D03E918EC"/>
           </w:placeholder>
         </w:sdtPr>
+        <w:sdtEndPr/>
         <w:sdtContent>
           <w:r>
             <w:rPr>
@@ -21519,6 +21312,7 @@
             <w:docPart w:val="E21FCD034384C44687B9D2C55C314646"/>
           </w:placeholder>
         </w:sdtPr>
+        <w:sdtEndPr/>
         <w:sdtContent>
           <w:r>
             <w:rPr>
@@ -21574,27 +21368,7 @@
           <w:i/>
           <w:iCs w:val="0"/>
         </w:rPr>
-        <w:t>Método del (</w:t>
-      </w:r>
-      <w:proofErr w:type="spellStart"/>
-      <w:r>
-        <w:rPr>
-          <w:b w:val="0"/>
-          <w:bCs/>
-          <w:i/>
-          <w:iCs w:val="0"/>
-        </w:rPr>
-        <w:t>Elbow</w:t>
-      </w:r>
-      <w:proofErr w:type="spellEnd"/>
-      <w:r>
-        <w:rPr>
-          <w:b w:val="0"/>
-          <w:bCs/>
-          <w:i/>
-          <w:iCs w:val="0"/>
-        </w:rPr>
-        <w:t>) y su aplicación en el K-modas</w:t>
+        <w:t>Método del (Elbow) y su aplicación en el K-modas</w:t>
       </w:r>
     </w:p>
     <w:p>
@@ -21688,6 +21462,7 @@
             <w:docPart w:val="2D068ED3CE72F44C9590F7923CB161F3"/>
           </w:placeholder>
         </w:sdtPr>
+        <w:sdtEndPr/>
         <w:sdtContent>
           <w:r>
             <w:rPr>
@@ -21827,6 +21602,7 @@
             <w:docPart w:val="A2B079BD23A510429C8A04CA432995FF"/>
           </w:placeholder>
         </w:sdtPr>
+        <w:sdtEndPr/>
         <w:sdtContent>
           <w:r>
             <w:rPr>
@@ -21893,21 +21669,7 @@
         <w:rPr>
           <w:lang w:val="es-US"/>
         </w:rPr>
-        <w:t xml:space="preserve">Mira las siguientes variables: estas variables las utilizaré para hacer un clúster, mi idea es comparar con el indicador de informalidad construido, para ello los pasos son los siguientes: usemos un k=2 y </w:t>
-      </w:r>
-      <w:proofErr w:type="spellStart"/>
-      <w:r>
-        <w:rPr>
-          <w:lang w:val="es-US"/>
-        </w:rPr>
-        <w:t>n_init</w:t>
-      </w:r>
-      <w:proofErr w:type="spellEnd"/>
-      <w:r>
-        <w:rPr>
-          <w:lang w:val="es-US"/>
-        </w:rPr>
-        <w:t>=20, el clúster solo elabóralo con las 7 variables mostradas, y sobre compararemos, con el indicador. La forma en que se comparara es: Coloquemos 2 gráficos de edad e ingreso de ocupación principal (tal como te mostré en la imagen), el primero agrupado con la clasificación del clúster y el segundo con la clasificación del índice de informalidad. Nota importante no te olvides de estandarizar las variables. Existe información adicional que necesitas para realizar la tarea encomendada?</w:t>
+        <w:t>Mira las siguientes variables: estas variables las utilizaré para hacer un clúster, mi idea es comparar con el indicador de informalidad construido, para ello los pasos son los siguientes: usemos un k=2 y n_init=20, el clúster solo elabóralo con las 7 variables mostradas, y sobre compararemos, con el indicador. La forma en que se comparara es: Coloquemos 2 gráficos de edad e ingreso de ocupación principal (tal como te mostré en la imagen), el primero agrupado con la clasificación del clúster y el segundo con la clasificación del índice de informalidad. Nota importante no te olvides de estandarizar las variables. Existe información adicional que necesitas para realizar la tarea encomendada?</w:t>
       </w:r>
     </w:p>
     <w:p>
@@ -21939,33 +21701,11 @@
           <w:lang w:val="es-US"/>
         </w:rPr>
       </w:pPr>
-      <w:proofErr w:type="spellStart"/>
       <w:r>
         <w:rPr>
           <w:lang w:val="es-US"/>
         </w:rPr>
-        <w:t>Explicame</w:t>
-      </w:r>
-      <w:proofErr w:type="spellEnd"/>
-      <w:r>
-        <w:rPr>
-          <w:lang w:val="es-US"/>
-        </w:rPr>
-        <w:t xml:space="preserve"> que es un </w:t>
-      </w:r>
-      <w:proofErr w:type="spellStart"/>
-      <w:r>
-        <w:rPr>
-          <w:lang w:val="es-US"/>
-        </w:rPr>
-        <w:t>dendograma</w:t>
-      </w:r>
-      <w:proofErr w:type="spellEnd"/>
-      <w:r>
-        <w:rPr>
-          <w:lang w:val="es-US"/>
-        </w:rPr>
-        <w:t>, también es necesario estandarizar?</w:t>
+        <w:t>Explicame que es un dendograma, también es necesario estandarizar?</w:t>
       </w:r>
     </w:p>
     <w:p>
@@ -21983,16 +21723,8 @@
         <w:rPr>
           <w:lang w:val="es-US"/>
         </w:rPr>
-        <w:t xml:space="preserve">De acuerdo, sobre las variables que aplicadas en el clúster k=2 y el gráfico de codo, apliquemos el </w:t>
-      </w:r>
-      <w:proofErr w:type="spellStart"/>
-      <w:r>
-        <w:rPr>
-          <w:lang w:val="es-US"/>
-        </w:rPr>
-        <w:t>dendograma</w:t>
-      </w:r>
-      <w:proofErr w:type="spellEnd"/>
+        <w:t>De acuerdo, sobre las variables que aplicadas en el clúster k=2 y el gráfico de codo, apliquemos el dendograma</w:t>
+      </w:r>
     </w:p>
     <w:p>
       <w:pPr>
@@ -22009,49 +21741,7 @@
         <w:rPr>
           <w:lang w:val="es-US"/>
         </w:rPr>
-        <w:t xml:space="preserve">Entiendo que si el agrupamiento de 2 </w:t>
-      </w:r>
-      <w:proofErr w:type="spellStart"/>
-      <w:r>
-        <w:rPr>
-          <w:lang w:val="es-US"/>
-        </w:rPr>
-        <w:t>cluster</w:t>
-      </w:r>
-      <w:proofErr w:type="spellEnd"/>
-      <w:r>
-        <w:rPr>
-          <w:lang w:val="es-US"/>
-        </w:rPr>
-        <w:t xml:space="preserve"> es más alto, significa que el algoritmo recomienda un k=2, en este caso veo que </w:t>
-      </w:r>
-      <w:proofErr w:type="spellStart"/>
-      <w:r>
-        <w:rPr>
-          <w:lang w:val="es-US"/>
-        </w:rPr>
-        <w:t>seria</w:t>
-      </w:r>
-      <w:proofErr w:type="spellEnd"/>
-      <w:r>
-        <w:rPr>
-          <w:lang w:val="es-US"/>
-        </w:rPr>
-        <w:t xml:space="preserve"> entre 4 y 5 </w:t>
-      </w:r>
-      <w:proofErr w:type="spellStart"/>
-      <w:r>
-        <w:rPr>
-          <w:lang w:val="es-US"/>
-        </w:rPr>
-        <w:t>aprox</w:t>
-      </w:r>
-      <w:proofErr w:type="spellEnd"/>
-      <w:r>
-        <w:rPr>
-          <w:lang w:val="es-US"/>
-        </w:rPr>
-        <w:t xml:space="preserve"> (mira la imagen cargada), te parece que es correcta esa interpretación?</w:t>
+        <w:t>Entiendo que si el agrupamiento de 2 cluster es más alto, significa que el algoritmo recomienda un k=2, en este caso veo que seria entre 4 y 5 aprox (mira la imagen cargada), te parece que es correcta esa interpretación?</w:t>
       </w:r>
     </w:p>
     <w:p>
@@ -22069,35 +21759,7 @@
         <w:rPr>
           <w:lang w:val="es-US"/>
         </w:rPr>
-        <w:t xml:space="preserve">En </w:t>
-      </w:r>
-      <w:proofErr w:type="spellStart"/>
-      <w:r>
-        <w:rPr>
-          <w:lang w:val="es-US"/>
-        </w:rPr>
-        <w:t>que</w:t>
-      </w:r>
-      <w:proofErr w:type="spellEnd"/>
-      <w:r>
-        <w:rPr>
-          <w:lang w:val="es-US"/>
-        </w:rPr>
-        <w:t xml:space="preserve"> se diferencia el </w:t>
-      </w:r>
-      <w:proofErr w:type="spellStart"/>
-      <w:r>
-        <w:rPr>
-          <w:lang w:val="es-US"/>
-        </w:rPr>
-        <w:t>dendograma</w:t>
-      </w:r>
-      <w:proofErr w:type="spellEnd"/>
-      <w:r>
-        <w:rPr>
-          <w:lang w:val="es-US"/>
-        </w:rPr>
-        <w:t xml:space="preserve"> como lo que venimos trabajando?</w:t>
+        <w:t>En que se diferencia el dendograma como lo que venimos trabajando?</w:t>
       </w:r>
     </w:p>
     <w:p>
@@ -22170,21 +21832,7 @@
         <w:rPr>
           <w:lang w:val="es-US"/>
         </w:rPr>
-        <w:t xml:space="preserve">Perfecto, estos son los resultados, aquí podrás ver las variables y su respectivo tipo. Muchas de las variables son categóricas, es necesario que las que tienen más de 1 nivel se conviertan en </w:t>
-      </w:r>
-      <w:proofErr w:type="spellStart"/>
-      <w:r>
-        <w:rPr>
-          <w:lang w:val="es-US"/>
-        </w:rPr>
-        <w:t>dummy</w:t>
-      </w:r>
-      <w:proofErr w:type="spellEnd"/>
-      <w:r>
-        <w:rPr>
-          <w:lang w:val="es-US"/>
-        </w:rPr>
-        <w:t>?</w:t>
+        <w:t>Perfecto, estos son los resultados, aquí podrás ver las variables y su respectivo tipo. Muchas de las variables son categóricas, es necesario que las que tienen más de 1 nivel se conviertan en dummy?</w:t>
       </w:r>
     </w:p>
     <w:p>
@@ -22283,7 +21931,7 @@
 </file>
 
 <file path=word/endnotes.xml><?xml version="1.0" encoding="utf-8"?>
-<w:endnotes xmlns:wpc="http://schemas.microsoft.com/office/word/2010/wordprocessingCanvas" xmlns:cx="http://schemas.microsoft.com/office/drawing/2014/chartex" xmlns:cx1="http://schemas.microsoft.com/office/drawing/2015/9/8/chartex" xmlns:cx2="http://schemas.microsoft.com/office/drawing/2015/10/21/chartex" xmlns:cx3="http://schemas.microsoft.com/office/drawing/2016/5/9/chartex" xmlns:cx4="http://schemas.microsoft.com/office/drawing/2016/5/10/chartex" xmlns:cx5="http://schemas.microsoft.com/office/drawing/2016/5/11/chartex" xmlns:cx6="http://schemas.microsoft.com/office/drawing/2016/5/12/chartex" xmlns:cx7="http://schemas.microsoft.com/office/drawing/2016/5/13/chartex" xmlns:cx8="http://schemas.microsoft.com/office/drawing/2016/5/14/chartex" xmlns:mc="http://schemas.openxmlformats.org/markup-compatibility/2006" xmlns:aink="http://schemas.microsoft.com/office/drawing/2016/ink" xmlns:am3d="http://schemas.microsoft.com/office/drawing/2017/model3d" xmlns:o="urn:schemas-microsoft-com:office:office" xmlns:oel="http://schemas.microsoft.com/office/2019/extlst" xmlns:r="http://schemas.openxmlformats.org/officeDocument/2006/relationships" xmlns:m="http://schemas.openxmlformats.org/officeDocument/2006/math" xmlns:v="urn:schemas-microsoft-com:vml" xmlns:wp14="http://schemas.microsoft.com/office/word/2010/wordprocessingDrawing" xmlns:wp="http://schemas.openxmlformats.org/drawingml/2006/wordprocessingDrawing" xmlns:w10="urn:schemas-microsoft-com:office:word" xmlns:w="http://schemas.openxmlformats.org/wordprocessingml/2006/main" xmlns:w14="http://schemas.microsoft.com/office/word/2010/wordml" xmlns:w15="http://schemas.microsoft.com/office/word/2012/wordml" xmlns:w16cex="http://schemas.microsoft.com/office/word/2018/wordml/cex" xmlns:w16cid="http://schemas.microsoft.com/office/word/2016/wordml/cid" xmlns:w16="http://schemas.microsoft.com/office/word/2018/wordml" xmlns:w16du="http://schemas.microsoft.com/office/word/2023/wordml/word16du" xmlns:w16sdtdh="http://schemas.microsoft.com/office/word/2020/wordml/sdtdatahash" xmlns:w16sdtfl="http://schemas.microsoft.com/office/word/2024/wordml/sdtformatlock" xmlns:w16se="http://schemas.microsoft.com/office/word/2015/wordml/symex" xmlns:wpg="http://schemas.microsoft.com/office/word/2010/wordprocessingGroup" xmlns:wpi="http://schemas.microsoft.com/office/word/2010/wordprocessingInk" xmlns:wne="http://schemas.microsoft.com/office/word/2006/wordml" xmlns:wps="http://schemas.microsoft.com/office/word/2010/wordprocessingShape" mc:Ignorable="w14 w15 w16se w16cid w16 w16cex w16sdtdh w16sdtfl w16du wp14">
+<w:endnotes xmlns:wpc="http://schemas.microsoft.com/office/word/2010/wordprocessingCanvas" xmlns:cx="http://schemas.microsoft.com/office/drawing/2014/chartex" xmlns:cx1="http://schemas.microsoft.com/office/drawing/2015/9/8/chartex" xmlns:cx2="http://schemas.microsoft.com/office/drawing/2015/10/21/chartex" xmlns:cx3="http://schemas.microsoft.com/office/drawing/2016/5/9/chartex" xmlns:cx4="http://schemas.microsoft.com/office/drawing/2016/5/10/chartex" xmlns:cx5="http://schemas.microsoft.com/office/drawing/2016/5/11/chartex" xmlns:cx6="http://schemas.microsoft.com/office/drawing/2016/5/12/chartex" xmlns:cx7="http://schemas.microsoft.com/office/drawing/2016/5/13/chartex" xmlns:cx8="http://schemas.microsoft.com/office/drawing/2016/5/14/chartex" xmlns:mc="http://schemas.openxmlformats.org/markup-compatibility/2006" xmlns:aink="http://schemas.microsoft.com/office/drawing/2016/ink" xmlns:am3d="http://schemas.microsoft.com/office/drawing/2017/model3d" xmlns:o="urn:schemas-microsoft-com:office:office" xmlns:r="http://schemas.openxmlformats.org/officeDocument/2006/relationships" xmlns:m="http://schemas.openxmlformats.org/officeDocument/2006/math" xmlns:v="urn:schemas-microsoft-com:vml" xmlns:wp14="http://schemas.microsoft.com/office/word/2010/wordprocessingDrawing" xmlns:wp="http://schemas.openxmlformats.org/drawingml/2006/wordprocessingDrawing" xmlns:w10="urn:schemas-microsoft-com:office:word" xmlns:w="http://schemas.openxmlformats.org/wordprocessingml/2006/main" xmlns:w14="http://schemas.microsoft.com/office/word/2010/wordml" xmlns:w15="http://schemas.microsoft.com/office/word/2012/wordml" xmlns:w16cex="http://schemas.microsoft.com/office/word/2018/wordml/cex" xmlns:w16cid="http://schemas.microsoft.com/office/word/2016/wordml/cid" xmlns:w16="http://schemas.microsoft.com/office/word/2018/wordml" xmlns:w16sdtdh="http://schemas.microsoft.com/office/word/2020/wordml/sdtdatahash" xmlns:w16se="http://schemas.microsoft.com/office/word/2015/wordml/symex" xmlns:wpg="http://schemas.microsoft.com/office/word/2010/wordprocessingGroup" xmlns:wpi="http://schemas.microsoft.com/office/word/2010/wordprocessingInk" xmlns:wne="http://schemas.microsoft.com/office/word/2006/wordml" xmlns:wps="http://schemas.microsoft.com/office/word/2010/wordprocessingShape" mc:Ignorable="w14 w15 w16se w16cid w16 w16cex w16sdtdh wp14">
   <w:endnote w:type="separator" w:id="-1">
     <w:p>
       <w:pPr>
@@ -22308,7 +21956,7 @@
 </file>
 
 <file path=word/footer1.xml><?xml version="1.0" encoding="utf-8"?>
-<w:ftr xmlns:wpc="http://schemas.microsoft.com/office/word/2010/wordprocessingCanvas" xmlns:cx="http://schemas.microsoft.com/office/drawing/2014/chartex" xmlns:cx1="http://schemas.microsoft.com/office/drawing/2015/9/8/chartex" xmlns:cx2="http://schemas.microsoft.com/office/drawing/2015/10/21/chartex" xmlns:cx3="http://schemas.microsoft.com/office/drawing/2016/5/9/chartex" xmlns:cx4="http://schemas.microsoft.com/office/drawing/2016/5/10/chartex" xmlns:cx5="http://schemas.microsoft.com/office/drawing/2016/5/11/chartex" xmlns:cx6="http://schemas.microsoft.com/office/drawing/2016/5/12/chartex" xmlns:cx7="http://schemas.microsoft.com/office/drawing/2016/5/13/chartex" xmlns:cx8="http://schemas.microsoft.com/office/drawing/2016/5/14/chartex" xmlns:mc="http://schemas.openxmlformats.org/markup-compatibility/2006" xmlns:aink="http://schemas.microsoft.com/office/drawing/2016/ink" xmlns:am3d="http://schemas.microsoft.com/office/drawing/2017/model3d" xmlns:o="urn:schemas-microsoft-com:office:office" xmlns:oel="http://schemas.microsoft.com/office/2019/extlst" xmlns:r="http://schemas.openxmlformats.org/officeDocument/2006/relationships" xmlns:m="http://schemas.openxmlformats.org/officeDocument/2006/math" xmlns:v="urn:schemas-microsoft-com:vml" xmlns:wp14="http://schemas.microsoft.com/office/word/2010/wordprocessingDrawing" xmlns:wp="http://schemas.openxmlformats.org/drawingml/2006/wordprocessingDrawing" xmlns:w10="urn:schemas-microsoft-com:office:word" xmlns:w="http://schemas.openxmlformats.org/wordprocessingml/2006/main" xmlns:w14="http://schemas.microsoft.com/office/word/2010/wordml" xmlns:w15="http://schemas.microsoft.com/office/word/2012/wordml" xmlns:w16cex="http://schemas.microsoft.com/office/word/2018/wordml/cex" xmlns:w16cid="http://schemas.microsoft.com/office/word/2016/wordml/cid" xmlns:w16="http://schemas.microsoft.com/office/word/2018/wordml" xmlns:w16du="http://schemas.microsoft.com/office/word/2023/wordml/word16du" xmlns:w16sdtdh="http://schemas.microsoft.com/office/word/2020/wordml/sdtdatahash" xmlns:w16sdtfl="http://schemas.microsoft.com/office/word/2024/wordml/sdtformatlock" xmlns:w16se="http://schemas.microsoft.com/office/word/2015/wordml/symex" xmlns:wpg="http://schemas.microsoft.com/office/word/2010/wordprocessingGroup" xmlns:wpi="http://schemas.microsoft.com/office/word/2010/wordprocessingInk" xmlns:wne="http://schemas.microsoft.com/office/word/2006/wordml" xmlns:wps="http://schemas.microsoft.com/office/word/2010/wordprocessingShape" mc:Ignorable="w14 w15 w16se w16cid w16 w16cex w16sdtdh w16sdtfl w16du wp14">
+<w:ftr xmlns:wpc="http://schemas.microsoft.com/office/word/2010/wordprocessingCanvas" xmlns:cx="http://schemas.microsoft.com/office/drawing/2014/chartex" xmlns:cx1="http://schemas.microsoft.com/office/drawing/2015/9/8/chartex" xmlns:cx2="http://schemas.microsoft.com/office/drawing/2015/10/21/chartex" xmlns:cx3="http://schemas.microsoft.com/office/drawing/2016/5/9/chartex" xmlns:cx4="http://schemas.microsoft.com/office/drawing/2016/5/10/chartex" xmlns:cx5="http://schemas.microsoft.com/office/drawing/2016/5/11/chartex" xmlns:cx6="http://schemas.microsoft.com/office/drawing/2016/5/12/chartex" xmlns:cx7="http://schemas.microsoft.com/office/drawing/2016/5/13/chartex" xmlns:cx8="http://schemas.microsoft.com/office/drawing/2016/5/14/chartex" xmlns:mc="http://schemas.openxmlformats.org/markup-compatibility/2006" xmlns:aink="http://schemas.microsoft.com/office/drawing/2016/ink" xmlns:am3d="http://schemas.microsoft.com/office/drawing/2017/model3d" xmlns:o="urn:schemas-microsoft-com:office:office" xmlns:r="http://schemas.openxmlformats.org/officeDocument/2006/relationships" xmlns:m="http://schemas.openxmlformats.org/officeDocument/2006/math" xmlns:v="urn:schemas-microsoft-com:vml" xmlns:wp14="http://schemas.microsoft.com/office/word/2010/wordprocessingDrawing" xmlns:wp="http://schemas.openxmlformats.org/drawingml/2006/wordprocessingDrawing" xmlns:w10="urn:schemas-microsoft-com:office:word" xmlns:w="http://schemas.openxmlformats.org/wordprocessingml/2006/main" xmlns:w14="http://schemas.microsoft.com/office/word/2010/wordml" xmlns:w15="http://schemas.microsoft.com/office/word/2012/wordml" xmlns:w16cex="http://schemas.microsoft.com/office/word/2018/wordml/cex" xmlns:w16cid="http://schemas.microsoft.com/office/word/2016/wordml/cid" xmlns:w16="http://schemas.microsoft.com/office/word/2018/wordml" xmlns:w16sdtdh="http://schemas.microsoft.com/office/word/2020/wordml/sdtdatahash" xmlns:w16se="http://schemas.microsoft.com/office/word/2015/wordml/symex" xmlns:wpg="http://schemas.microsoft.com/office/word/2010/wordprocessingGroup" xmlns:wpi="http://schemas.microsoft.com/office/word/2010/wordprocessingInk" xmlns:wne="http://schemas.microsoft.com/office/word/2006/wordml" xmlns:wps="http://schemas.microsoft.com/office/word/2010/wordprocessingShape" mc:Ignorable="w14 w15 w16se w16cid w16 w16cex w16sdtdh wp14">
   <w:sdt>
     <w:sdtPr>
       <w:rPr>
@@ -22320,6 +21968,11 @@
         <w:docPartUnique/>
       </w:docPartObj>
     </w:sdtPr>
+    <w:sdtEndPr>
+      <w:rPr>
+        <w:rStyle w:val="Nmerodepgina"/>
+      </w:rPr>
+    </w:sdtEndPr>
     <w:sdtContent>
       <w:p>
         <w:pPr>
@@ -22365,7 +22018,7 @@
 </file>
 
 <file path=word/footer2.xml><?xml version="1.0" encoding="utf-8"?>
-<w:ftr xmlns:wpc="http://schemas.microsoft.com/office/word/2010/wordprocessingCanvas" xmlns:cx="http://schemas.microsoft.com/office/drawing/2014/chartex" xmlns:cx1="http://schemas.microsoft.com/office/drawing/2015/9/8/chartex" xmlns:cx2="http://schemas.microsoft.com/office/drawing/2015/10/21/chartex" xmlns:cx3="http://schemas.microsoft.com/office/drawing/2016/5/9/chartex" xmlns:cx4="http://schemas.microsoft.com/office/drawing/2016/5/10/chartex" xmlns:cx5="http://schemas.microsoft.com/office/drawing/2016/5/11/chartex" xmlns:cx6="http://schemas.microsoft.com/office/drawing/2016/5/12/chartex" xmlns:cx7="http://schemas.microsoft.com/office/drawing/2016/5/13/chartex" xmlns:cx8="http://schemas.microsoft.com/office/drawing/2016/5/14/chartex" xmlns:mc="http://schemas.openxmlformats.org/markup-compatibility/2006" xmlns:aink="http://schemas.microsoft.com/office/drawing/2016/ink" xmlns:am3d="http://schemas.microsoft.com/office/drawing/2017/model3d" xmlns:o="urn:schemas-microsoft-com:office:office" xmlns:oel="http://schemas.microsoft.com/office/2019/extlst" xmlns:r="http://schemas.openxmlformats.org/officeDocument/2006/relationships" xmlns:m="http://schemas.openxmlformats.org/officeDocument/2006/math" xmlns:v="urn:schemas-microsoft-com:vml" xmlns:wp14="http://schemas.microsoft.com/office/word/2010/wordprocessingDrawing" xmlns:wp="http://schemas.openxmlformats.org/drawingml/2006/wordprocessingDrawing" xmlns:w10="urn:schemas-microsoft-com:office:word" xmlns:w="http://schemas.openxmlformats.org/wordprocessingml/2006/main" xmlns:w14="http://schemas.microsoft.com/office/word/2010/wordml" xmlns:w15="http://schemas.microsoft.com/office/word/2012/wordml" xmlns:w16cex="http://schemas.microsoft.com/office/word/2018/wordml/cex" xmlns:w16cid="http://schemas.microsoft.com/office/word/2016/wordml/cid" xmlns:w16="http://schemas.microsoft.com/office/word/2018/wordml" xmlns:w16du="http://schemas.microsoft.com/office/word/2023/wordml/word16du" xmlns:w16sdtdh="http://schemas.microsoft.com/office/word/2020/wordml/sdtdatahash" xmlns:w16sdtfl="http://schemas.microsoft.com/office/word/2024/wordml/sdtformatlock" xmlns:w16se="http://schemas.microsoft.com/office/word/2015/wordml/symex" xmlns:wpg="http://schemas.microsoft.com/office/word/2010/wordprocessingGroup" xmlns:wpi="http://schemas.microsoft.com/office/word/2010/wordprocessingInk" xmlns:wne="http://schemas.microsoft.com/office/word/2006/wordml" xmlns:wps="http://schemas.microsoft.com/office/word/2010/wordprocessingShape" mc:Ignorable="w14 w15 w16se w16cid w16 w16cex w16sdtdh w16sdtfl w16du wp14">
+<w:ftr xmlns:wpc="http://schemas.microsoft.com/office/word/2010/wordprocessingCanvas" xmlns:cx="http://schemas.microsoft.com/office/drawing/2014/chartex" xmlns:cx1="http://schemas.microsoft.com/office/drawing/2015/9/8/chartex" xmlns:cx2="http://schemas.microsoft.com/office/drawing/2015/10/21/chartex" xmlns:cx3="http://schemas.microsoft.com/office/drawing/2016/5/9/chartex" xmlns:cx4="http://schemas.microsoft.com/office/drawing/2016/5/10/chartex" xmlns:cx5="http://schemas.microsoft.com/office/drawing/2016/5/11/chartex" xmlns:cx6="http://schemas.microsoft.com/office/drawing/2016/5/12/chartex" xmlns:cx7="http://schemas.microsoft.com/office/drawing/2016/5/13/chartex" xmlns:cx8="http://schemas.microsoft.com/office/drawing/2016/5/14/chartex" xmlns:mc="http://schemas.openxmlformats.org/markup-compatibility/2006" xmlns:aink="http://schemas.microsoft.com/office/drawing/2016/ink" xmlns:am3d="http://schemas.microsoft.com/office/drawing/2017/model3d" xmlns:o="urn:schemas-microsoft-com:office:office" xmlns:r="http://schemas.openxmlformats.org/officeDocument/2006/relationships" xmlns:m="http://schemas.openxmlformats.org/officeDocument/2006/math" xmlns:v="urn:schemas-microsoft-com:vml" xmlns:wp14="http://schemas.microsoft.com/office/word/2010/wordprocessingDrawing" xmlns:wp="http://schemas.openxmlformats.org/drawingml/2006/wordprocessingDrawing" xmlns:w10="urn:schemas-microsoft-com:office:word" xmlns:w="http://schemas.openxmlformats.org/wordprocessingml/2006/main" xmlns:w14="http://schemas.microsoft.com/office/word/2010/wordml" xmlns:w15="http://schemas.microsoft.com/office/word/2012/wordml" xmlns:w16cex="http://schemas.microsoft.com/office/word/2018/wordml/cex" xmlns:w16cid="http://schemas.microsoft.com/office/word/2016/wordml/cid" xmlns:w16="http://schemas.microsoft.com/office/word/2018/wordml" xmlns:w16sdtdh="http://schemas.microsoft.com/office/word/2020/wordml/sdtdatahash" xmlns:w16se="http://schemas.microsoft.com/office/word/2015/wordml/symex" xmlns:wpg="http://schemas.microsoft.com/office/word/2010/wordprocessingGroup" xmlns:wpi="http://schemas.microsoft.com/office/word/2010/wordprocessingInk" xmlns:wne="http://schemas.microsoft.com/office/word/2006/wordml" xmlns:wps="http://schemas.microsoft.com/office/word/2010/wordprocessingShape" mc:Ignorable="w14 w15 w16se w16cid w16 w16cex w16sdtdh wp14">
   <w:p>
     <w:pPr>
       <w:pStyle w:val="Piedepgina"/>
@@ -22384,7 +22037,7 @@
 </file>
 
 <file path=word/footer3.xml><?xml version="1.0" encoding="utf-8"?>
-<w:ftr xmlns:wpc="http://schemas.microsoft.com/office/word/2010/wordprocessingCanvas" xmlns:cx="http://schemas.microsoft.com/office/drawing/2014/chartex" xmlns:cx1="http://schemas.microsoft.com/office/drawing/2015/9/8/chartex" xmlns:cx2="http://schemas.microsoft.com/office/drawing/2015/10/21/chartex" xmlns:cx3="http://schemas.microsoft.com/office/drawing/2016/5/9/chartex" xmlns:cx4="http://schemas.microsoft.com/office/drawing/2016/5/10/chartex" xmlns:cx5="http://schemas.microsoft.com/office/drawing/2016/5/11/chartex" xmlns:cx6="http://schemas.microsoft.com/office/drawing/2016/5/12/chartex" xmlns:cx7="http://schemas.microsoft.com/office/drawing/2016/5/13/chartex" xmlns:cx8="http://schemas.microsoft.com/office/drawing/2016/5/14/chartex" xmlns:mc="http://schemas.openxmlformats.org/markup-compatibility/2006" xmlns:aink="http://schemas.microsoft.com/office/drawing/2016/ink" xmlns:am3d="http://schemas.microsoft.com/office/drawing/2017/model3d" xmlns:o="urn:schemas-microsoft-com:office:office" xmlns:oel="http://schemas.microsoft.com/office/2019/extlst" xmlns:r="http://schemas.openxmlformats.org/officeDocument/2006/relationships" xmlns:m="http://schemas.openxmlformats.org/officeDocument/2006/math" xmlns:v="urn:schemas-microsoft-com:vml" xmlns:wp14="http://schemas.microsoft.com/office/word/2010/wordprocessingDrawing" xmlns:wp="http://schemas.openxmlformats.org/drawingml/2006/wordprocessingDrawing" xmlns:w10="urn:schemas-microsoft-com:office:word" xmlns:w="http://schemas.openxmlformats.org/wordprocessingml/2006/main" xmlns:w14="http://schemas.microsoft.com/office/word/2010/wordml" xmlns:w15="http://schemas.microsoft.com/office/word/2012/wordml" xmlns:w16cex="http://schemas.microsoft.com/office/word/2018/wordml/cex" xmlns:w16cid="http://schemas.microsoft.com/office/word/2016/wordml/cid" xmlns:w16="http://schemas.microsoft.com/office/word/2018/wordml" xmlns:w16du="http://schemas.microsoft.com/office/word/2023/wordml/word16du" xmlns:w16sdtdh="http://schemas.microsoft.com/office/word/2020/wordml/sdtdatahash" xmlns:w16sdtfl="http://schemas.microsoft.com/office/word/2024/wordml/sdtformatlock" xmlns:w16se="http://schemas.microsoft.com/office/word/2015/wordml/symex" xmlns:wpg="http://schemas.microsoft.com/office/word/2010/wordprocessingGroup" xmlns:wpi="http://schemas.microsoft.com/office/word/2010/wordprocessingInk" xmlns:wne="http://schemas.microsoft.com/office/word/2006/wordml" xmlns:wps="http://schemas.microsoft.com/office/word/2010/wordprocessingShape" mc:Ignorable="w14 w15 w16se w16cid w16 w16cex w16sdtdh w16sdtfl w16du wp14">
+<w:ftr xmlns:wpc="http://schemas.microsoft.com/office/word/2010/wordprocessingCanvas" xmlns:cx="http://schemas.microsoft.com/office/drawing/2014/chartex" xmlns:cx1="http://schemas.microsoft.com/office/drawing/2015/9/8/chartex" xmlns:cx2="http://schemas.microsoft.com/office/drawing/2015/10/21/chartex" xmlns:cx3="http://schemas.microsoft.com/office/drawing/2016/5/9/chartex" xmlns:cx4="http://schemas.microsoft.com/office/drawing/2016/5/10/chartex" xmlns:cx5="http://schemas.microsoft.com/office/drawing/2016/5/11/chartex" xmlns:cx6="http://schemas.microsoft.com/office/drawing/2016/5/12/chartex" xmlns:cx7="http://schemas.microsoft.com/office/drawing/2016/5/13/chartex" xmlns:cx8="http://schemas.microsoft.com/office/drawing/2016/5/14/chartex" xmlns:mc="http://schemas.openxmlformats.org/markup-compatibility/2006" xmlns:aink="http://schemas.microsoft.com/office/drawing/2016/ink" xmlns:am3d="http://schemas.microsoft.com/office/drawing/2017/model3d" xmlns:o="urn:schemas-microsoft-com:office:office" xmlns:r="http://schemas.openxmlformats.org/officeDocument/2006/relationships" xmlns:m="http://schemas.openxmlformats.org/officeDocument/2006/math" xmlns:v="urn:schemas-microsoft-com:vml" xmlns:wp14="http://schemas.microsoft.com/office/word/2010/wordprocessingDrawing" xmlns:wp="http://schemas.openxmlformats.org/drawingml/2006/wordprocessingDrawing" xmlns:w10="urn:schemas-microsoft-com:office:word" xmlns:w="http://schemas.openxmlformats.org/wordprocessingml/2006/main" xmlns:w14="http://schemas.microsoft.com/office/word/2010/wordml" xmlns:w15="http://schemas.microsoft.com/office/word/2012/wordml" xmlns:w16cex="http://schemas.microsoft.com/office/word/2018/wordml/cex" xmlns:w16cid="http://schemas.microsoft.com/office/word/2016/wordml/cid" xmlns:w16="http://schemas.microsoft.com/office/word/2018/wordml" xmlns:w16sdtdh="http://schemas.microsoft.com/office/word/2020/wordml/sdtdatahash" xmlns:w16se="http://schemas.microsoft.com/office/word/2015/wordml/symex" xmlns:wpg="http://schemas.microsoft.com/office/word/2010/wordprocessingGroup" xmlns:wpi="http://schemas.microsoft.com/office/word/2010/wordprocessingInk" xmlns:wne="http://schemas.microsoft.com/office/word/2006/wordml" xmlns:wps="http://schemas.microsoft.com/office/word/2010/wordprocessingShape" mc:Ignorable="w14 w15 w16se w16cid w16 w16cex w16sdtdh wp14">
   <w:sdt>
     <w:sdtPr>
       <w:rPr>
@@ -22396,6 +22049,11 @@
         <w:docPartUnique/>
       </w:docPartObj>
     </w:sdtPr>
+    <w:sdtEndPr>
+      <w:rPr>
+        <w:rStyle w:val="Nmerodepgina"/>
+      </w:rPr>
+    </w:sdtEndPr>
     <w:sdtContent>
       <w:p>
         <w:pPr>
@@ -22448,7 +22106,7 @@
 </file>
 
 <file path=word/footnotes.xml><?xml version="1.0" encoding="utf-8"?>
-<w:footnotes xmlns:wpc="http://schemas.microsoft.com/office/word/2010/wordprocessingCanvas" xmlns:cx="http://schemas.microsoft.com/office/drawing/2014/chartex" xmlns:cx1="http://schemas.microsoft.com/office/drawing/2015/9/8/chartex" xmlns:cx2="http://schemas.microsoft.com/office/drawing/2015/10/21/chartex" xmlns:cx3="http://schemas.microsoft.com/office/drawing/2016/5/9/chartex" xmlns:cx4="http://schemas.microsoft.com/office/drawing/2016/5/10/chartex" xmlns:cx5="http://schemas.microsoft.com/office/drawing/2016/5/11/chartex" xmlns:cx6="http://schemas.microsoft.com/office/drawing/2016/5/12/chartex" xmlns:cx7="http://schemas.microsoft.com/office/drawing/2016/5/13/chartex" xmlns:cx8="http://schemas.microsoft.com/office/drawing/2016/5/14/chartex" xmlns:mc="http://schemas.openxmlformats.org/markup-compatibility/2006" xmlns:aink="http://schemas.microsoft.com/office/drawing/2016/ink" xmlns:am3d="http://schemas.microsoft.com/office/drawing/2017/model3d" xmlns:o="urn:schemas-microsoft-com:office:office" xmlns:oel="http://schemas.microsoft.com/office/2019/extlst" xmlns:r="http://schemas.openxmlformats.org/officeDocument/2006/relationships" xmlns:m="http://schemas.openxmlformats.org/officeDocument/2006/math" xmlns:v="urn:schemas-microsoft-com:vml" xmlns:wp14="http://schemas.microsoft.com/office/word/2010/wordprocessingDrawing" xmlns:wp="http://schemas.openxmlformats.org/drawingml/2006/wordprocessingDrawing" xmlns:w10="urn:schemas-microsoft-com:office:word" xmlns:w="http://schemas.openxmlformats.org/wordprocessingml/2006/main" xmlns:w14="http://schemas.microsoft.com/office/word/2010/wordml" xmlns:w15="http://schemas.microsoft.com/office/word/2012/wordml" xmlns:w16cex="http://schemas.microsoft.com/office/word/2018/wordml/cex" xmlns:w16cid="http://schemas.microsoft.com/office/word/2016/wordml/cid" xmlns:w16="http://schemas.microsoft.com/office/word/2018/wordml" xmlns:w16du="http://schemas.microsoft.com/office/word/2023/wordml/word16du" xmlns:w16sdtdh="http://schemas.microsoft.com/office/word/2020/wordml/sdtdatahash" xmlns:w16sdtfl="http://schemas.microsoft.com/office/word/2024/wordml/sdtformatlock" xmlns:w16se="http://schemas.microsoft.com/office/word/2015/wordml/symex" xmlns:wpg="http://schemas.microsoft.com/office/word/2010/wordprocessingGroup" xmlns:wpi="http://schemas.microsoft.com/office/word/2010/wordprocessingInk" xmlns:wne="http://schemas.microsoft.com/office/word/2006/wordml" xmlns:wps="http://schemas.microsoft.com/office/word/2010/wordprocessingShape" mc:Ignorable="w14 w15 w16se w16cid w16 w16cex w16sdtdh w16sdtfl w16du wp14">
+<w:footnotes xmlns:wpc="http://schemas.microsoft.com/office/word/2010/wordprocessingCanvas" xmlns:cx="http://schemas.microsoft.com/office/drawing/2014/chartex" xmlns:cx1="http://schemas.microsoft.com/office/drawing/2015/9/8/chartex" xmlns:cx2="http://schemas.microsoft.com/office/drawing/2015/10/21/chartex" xmlns:cx3="http://schemas.microsoft.com/office/drawing/2016/5/9/chartex" xmlns:cx4="http://schemas.microsoft.com/office/drawing/2016/5/10/chartex" xmlns:cx5="http://schemas.microsoft.com/office/drawing/2016/5/11/chartex" xmlns:cx6="http://schemas.microsoft.com/office/drawing/2016/5/12/chartex" xmlns:cx7="http://schemas.microsoft.com/office/drawing/2016/5/13/chartex" xmlns:cx8="http://schemas.microsoft.com/office/drawing/2016/5/14/chartex" xmlns:mc="http://schemas.openxmlformats.org/markup-compatibility/2006" xmlns:aink="http://schemas.microsoft.com/office/drawing/2016/ink" xmlns:am3d="http://schemas.microsoft.com/office/drawing/2017/model3d" xmlns:o="urn:schemas-microsoft-com:office:office" xmlns:r="http://schemas.openxmlformats.org/officeDocument/2006/relationships" xmlns:m="http://schemas.openxmlformats.org/officeDocument/2006/math" xmlns:v="urn:schemas-microsoft-com:vml" xmlns:wp14="http://schemas.microsoft.com/office/word/2010/wordprocessingDrawing" xmlns:wp="http://schemas.openxmlformats.org/drawingml/2006/wordprocessingDrawing" xmlns:w10="urn:schemas-microsoft-com:office:word" xmlns:w="http://schemas.openxmlformats.org/wordprocessingml/2006/main" xmlns:w14="http://schemas.microsoft.com/office/word/2010/wordml" xmlns:w15="http://schemas.microsoft.com/office/word/2012/wordml" xmlns:w16cex="http://schemas.microsoft.com/office/word/2018/wordml/cex" xmlns:w16cid="http://schemas.microsoft.com/office/word/2016/wordml/cid" xmlns:w16="http://schemas.microsoft.com/office/word/2018/wordml" xmlns:w16sdtdh="http://schemas.microsoft.com/office/word/2020/wordml/sdtdatahash" xmlns:w16se="http://schemas.microsoft.com/office/word/2015/wordml/symex" xmlns:wpg="http://schemas.microsoft.com/office/word/2010/wordprocessingGroup" xmlns:wpi="http://schemas.microsoft.com/office/word/2010/wordprocessingInk" xmlns:wne="http://schemas.microsoft.com/office/word/2006/wordml" xmlns:wps="http://schemas.microsoft.com/office/word/2010/wordprocessingShape" mc:Ignorable="w14 w15 w16se w16cid w16 w16cex w16sdtdh wp14">
   <w:footnote w:type="separator" w:id="-1">
     <w:p>
       <w:pPr>
@@ -22473,7 +22131,7 @@
 </file>
 
 <file path=word/numbering.xml><?xml version="1.0" encoding="utf-8"?>
-<w:numbering xmlns:wpc="http://schemas.microsoft.com/office/word/2010/wordprocessingCanvas" xmlns:cx="http://schemas.microsoft.com/office/drawing/2014/chartex" xmlns:cx1="http://schemas.microsoft.com/office/drawing/2015/9/8/chartex" xmlns:cx2="http://schemas.microsoft.com/office/drawing/2015/10/21/chartex" xmlns:cx3="http://schemas.microsoft.com/office/drawing/2016/5/9/chartex" xmlns:cx4="http://schemas.microsoft.com/office/drawing/2016/5/10/chartex" xmlns:cx5="http://schemas.microsoft.com/office/drawing/2016/5/11/chartex" xmlns:cx6="http://schemas.microsoft.com/office/drawing/2016/5/12/chartex" xmlns:cx7="http://schemas.microsoft.com/office/drawing/2016/5/13/chartex" xmlns:cx8="http://schemas.microsoft.com/office/drawing/2016/5/14/chartex" xmlns:mc="http://schemas.openxmlformats.org/markup-compatibility/2006" xmlns:aink="http://schemas.microsoft.com/office/drawing/2016/ink" xmlns:am3d="http://schemas.microsoft.com/office/drawing/2017/model3d" xmlns:o="urn:schemas-microsoft-com:office:office" xmlns:oel="http://schemas.microsoft.com/office/2019/extlst" xmlns:r="http://schemas.openxmlformats.org/officeDocument/2006/relationships" xmlns:m="http://schemas.openxmlformats.org/officeDocument/2006/math" xmlns:v="urn:schemas-microsoft-com:vml" xmlns:wp14="http://schemas.microsoft.com/office/word/2010/wordprocessingDrawing" xmlns:wp="http://schemas.openxmlformats.org/drawingml/2006/wordprocessingDrawing" xmlns:w10="urn:schemas-microsoft-com:office:word" xmlns:w="http://schemas.openxmlformats.org/wordprocessingml/2006/main" xmlns:w14="http://schemas.microsoft.com/office/word/2010/wordml" xmlns:w15="http://schemas.microsoft.com/office/word/2012/wordml" xmlns:w16cex="http://schemas.microsoft.com/office/word/2018/wordml/cex" xmlns:w16cid="http://schemas.microsoft.com/office/word/2016/wordml/cid" xmlns:w16="http://schemas.microsoft.com/office/word/2018/wordml" xmlns:w16du="http://schemas.microsoft.com/office/word/2023/wordml/word16du" xmlns:w16sdtdh="http://schemas.microsoft.com/office/word/2020/wordml/sdtdatahash" xmlns:w16sdtfl="http://schemas.microsoft.com/office/word/2024/wordml/sdtformatlock" xmlns:w16se="http://schemas.microsoft.com/office/word/2015/wordml/symex" xmlns:wpg="http://schemas.microsoft.com/office/word/2010/wordprocessingGroup" xmlns:wpi="http://schemas.microsoft.com/office/word/2010/wordprocessingInk" xmlns:wne="http://schemas.microsoft.com/office/word/2006/wordml" xmlns:wps="http://schemas.microsoft.com/office/word/2010/wordprocessingShape" mc:Ignorable="w14 w15 w16se w16cid w16 w16cex w16sdtdh w16sdtfl w16du wp14">
+<w:numbering xmlns:wpc="http://schemas.microsoft.com/office/word/2010/wordprocessingCanvas" xmlns:cx="http://schemas.microsoft.com/office/drawing/2014/chartex" xmlns:cx1="http://schemas.microsoft.com/office/drawing/2015/9/8/chartex" xmlns:cx2="http://schemas.microsoft.com/office/drawing/2015/10/21/chartex" xmlns:cx3="http://schemas.microsoft.com/office/drawing/2016/5/9/chartex" xmlns:cx4="http://schemas.microsoft.com/office/drawing/2016/5/10/chartex" xmlns:cx5="http://schemas.microsoft.com/office/drawing/2016/5/11/chartex" xmlns:cx6="http://schemas.microsoft.com/office/drawing/2016/5/12/chartex" xmlns:cx7="http://schemas.microsoft.com/office/drawing/2016/5/13/chartex" xmlns:cx8="http://schemas.microsoft.com/office/drawing/2016/5/14/chartex" xmlns:mc="http://schemas.openxmlformats.org/markup-compatibility/2006" xmlns:aink="http://schemas.microsoft.com/office/drawing/2016/ink" xmlns:am3d="http://schemas.microsoft.com/office/drawing/2017/model3d" xmlns:o="urn:schemas-microsoft-com:office:office" xmlns:r="http://schemas.openxmlformats.org/officeDocument/2006/relationships" xmlns:m="http://schemas.openxmlformats.org/officeDocument/2006/math" xmlns:v="urn:schemas-microsoft-com:vml" xmlns:wp14="http://schemas.microsoft.com/office/word/2010/wordprocessingDrawing" xmlns:wp="http://schemas.openxmlformats.org/drawingml/2006/wordprocessingDrawing" xmlns:w10="urn:schemas-microsoft-com:office:word" xmlns:w="http://schemas.openxmlformats.org/wordprocessingml/2006/main" xmlns:w14="http://schemas.microsoft.com/office/word/2010/wordml" xmlns:w15="http://schemas.microsoft.com/office/word/2012/wordml" xmlns:w16cex="http://schemas.microsoft.com/office/word/2018/wordml/cex" xmlns:w16cid="http://schemas.microsoft.com/office/word/2016/wordml/cid" xmlns:w16="http://schemas.microsoft.com/office/word/2018/wordml" xmlns:w16sdtdh="http://schemas.microsoft.com/office/word/2020/wordml/sdtdatahash" xmlns:w16se="http://schemas.microsoft.com/office/word/2015/wordml/symex" xmlns:wpg="http://schemas.microsoft.com/office/word/2010/wordprocessingGroup" xmlns:wpi="http://schemas.microsoft.com/office/word/2010/wordprocessingInk" xmlns:wne="http://schemas.microsoft.com/office/word/2006/wordml" xmlns:wps="http://schemas.microsoft.com/office/word/2010/wordprocessingShape" mc:Ignorable="w14 w15 w16se w16cid w16 w16cex w16sdtdh wp14">
   <w:abstractNum w:abstractNumId="0" w15:restartNumberingAfterBreak="0">
     <w:nsid w:val="07EF9ED1"/>
     <w:multiLevelType w:val="hybridMultilevel"/>
@@ -22902,22 +22560,22 @@
       </w:pPr>
     </w:lvl>
   </w:abstractNum>
-  <w:num w:numId="1" w16cid:durableId="641158617">
+  <w:num w:numId="1">
     <w:abstractNumId w:val="2"/>
   </w:num>
-  <w:num w:numId="2" w16cid:durableId="2056274700">
+  <w:num w:numId="2">
     <w:abstractNumId w:val="3"/>
   </w:num>
-  <w:num w:numId="3" w16cid:durableId="1653636549">
+  <w:num w:numId="3">
     <w:abstractNumId w:val="1"/>
   </w:num>
-  <w:num w:numId="4" w16cid:durableId="159661207">
+  <w:num w:numId="4">
     <w:abstractNumId w:val="0"/>
   </w:num>
-  <w:num w:numId="5" w16cid:durableId="1016156957">
+  <w:num w:numId="5">
     <w:abstractNumId w:val="2"/>
   </w:num>
-  <w:num w:numId="6" w16cid:durableId="1180580691">
+  <w:num w:numId="6">
     <w:abstractNumId w:val="2"/>
   </w:num>
   <w:numIdMacAtCleanup w:val="3"/>
@@ -22925,7 +22583,7 @@
 </file>
 
 <file path=word/styles.xml><?xml version="1.0" encoding="utf-8"?>
-<w:styles xmlns:mc="http://schemas.openxmlformats.org/markup-compatibility/2006" xmlns:r="http://schemas.openxmlformats.org/officeDocument/2006/relationships" xmlns:w="http://schemas.openxmlformats.org/wordprocessingml/2006/main" xmlns:w14="http://schemas.microsoft.com/office/word/2010/wordml" xmlns:w15="http://schemas.microsoft.com/office/word/2012/wordml" xmlns:w16cex="http://schemas.microsoft.com/office/word/2018/wordml/cex" xmlns:w16cid="http://schemas.microsoft.com/office/word/2016/wordml/cid" xmlns:w16="http://schemas.microsoft.com/office/word/2018/wordml" xmlns:w16du="http://schemas.microsoft.com/office/word/2023/wordml/word16du" xmlns:w16sdtdh="http://schemas.microsoft.com/office/word/2020/wordml/sdtdatahash" xmlns:w16sdtfl="http://schemas.microsoft.com/office/word/2024/wordml/sdtformatlock" xmlns:w16se="http://schemas.microsoft.com/office/word/2015/wordml/symex" mc:Ignorable="w14 w15 w16se w16cid w16 w16cex w16sdtdh w16sdtfl w16du">
+<w:styles xmlns:mc="http://schemas.openxmlformats.org/markup-compatibility/2006" xmlns:r="http://schemas.openxmlformats.org/officeDocument/2006/relationships" xmlns:w="http://schemas.openxmlformats.org/wordprocessingml/2006/main" xmlns:w14="http://schemas.microsoft.com/office/word/2010/wordml" xmlns:w15="http://schemas.microsoft.com/office/word/2012/wordml" xmlns:w16cex="http://schemas.microsoft.com/office/word/2018/wordml/cex" xmlns:w16cid="http://schemas.microsoft.com/office/word/2016/wordml/cid" xmlns:w16="http://schemas.microsoft.com/office/word/2018/wordml" xmlns:w16sdtdh="http://schemas.microsoft.com/office/word/2020/wordml/sdtdatahash" xmlns:w16se="http://schemas.microsoft.com/office/word/2015/wordml/symex" mc:Ignorable="w14 w15 w16se w16cid w16 w16cex w16sdtdh">
   <w:docDefaults>
     <w:rPrDefault>
       <w:rPr>
@@ -24499,7 +24157,7 @@
 </file>
 
 <file path=word/glossary/document.xml><?xml version="1.0" encoding="utf-8"?>
-<w:glossaryDocument xmlns:wpc="http://schemas.microsoft.com/office/word/2010/wordprocessingCanvas" xmlns:cx="http://schemas.microsoft.com/office/drawing/2014/chartex" xmlns:cx1="http://schemas.microsoft.com/office/drawing/2015/9/8/chartex" xmlns:cx2="http://schemas.microsoft.com/office/drawing/2015/10/21/chartex" xmlns:cx3="http://schemas.microsoft.com/office/drawing/2016/5/9/chartex" xmlns:cx4="http://schemas.microsoft.com/office/drawing/2016/5/10/chartex" xmlns:cx5="http://schemas.microsoft.com/office/drawing/2016/5/11/chartex" xmlns:cx6="http://schemas.microsoft.com/office/drawing/2016/5/12/chartex" xmlns:cx7="http://schemas.microsoft.com/office/drawing/2016/5/13/chartex" xmlns:cx8="http://schemas.microsoft.com/office/drawing/2016/5/14/chartex" xmlns:mc="http://schemas.openxmlformats.org/markup-compatibility/2006" xmlns:aink="http://schemas.microsoft.com/office/drawing/2016/ink" xmlns:am3d="http://schemas.microsoft.com/office/drawing/2017/model3d" xmlns:o="urn:schemas-microsoft-com:office:office" xmlns:oel="http://schemas.microsoft.com/office/2019/extlst" xmlns:r="http://schemas.openxmlformats.org/officeDocument/2006/relationships" xmlns:m="http://schemas.openxmlformats.org/officeDocument/2006/math" xmlns:v="urn:schemas-microsoft-com:vml" xmlns:wp14="http://schemas.microsoft.com/office/word/2010/wordprocessingDrawing" xmlns:wp="http://schemas.openxmlformats.org/drawingml/2006/wordprocessingDrawing" xmlns:w10="urn:schemas-microsoft-com:office:word" xmlns:w="http://schemas.openxmlformats.org/wordprocessingml/2006/main" xmlns:w14="http://schemas.microsoft.com/office/word/2010/wordml" xmlns:w15="http://schemas.microsoft.com/office/word/2012/wordml" xmlns:w16cex="http://schemas.microsoft.com/office/word/2018/wordml/cex" xmlns:w16cid="http://schemas.microsoft.com/office/word/2016/wordml/cid" xmlns:w16="http://schemas.microsoft.com/office/word/2018/wordml" xmlns:w16du="http://schemas.microsoft.com/office/word/2023/wordml/word16du" xmlns:w16sdtdh="http://schemas.microsoft.com/office/word/2020/wordml/sdtdatahash" xmlns:w16sdtfl="http://schemas.microsoft.com/office/word/2024/wordml/sdtformatlock" xmlns:w16se="http://schemas.microsoft.com/office/word/2015/wordml/symex" xmlns:wpg="http://schemas.microsoft.com/office/word/2010/wordprocessingGroup" xmlns:wpi="http://schemas.microsoft.com/office/word/2010/wordprocessingInk" xmlns:wne="http://schemas.microsoft.com/office/word/2006/wordml" xmlns:wps="http://schemas.microsoft.com/office/word/2010/wordprocessingShape" mc:Ignorable="w14 w15 w16se w16cid w16 w16cex w16sdtdh w16sdtfl w16du wp14">
+<w:glossaryDocument xmlns:wpc="http://schemas.microsoft.com/office/word/2010/wordprocessingCanvas" xmlns:cx="http://schemas.microsoft.com/office/drawing/2014/chartex" xmlns:cx1="http://schemas.microsoft.com/office/drawing/2015/9/8/chartex" xmlns:cx2="http://schemas.microsoft.com/office/drawing/2015/10/21/chartex" xmlns:cx3="http://schemas.microsoft.com/office/drawing/2016/5/9/chartex" xmlns:cx4="http://schemas.microsoft.com/office/drawing/2016/5/10/chartex" xmlns:cx5="http://schemas.microsoft.com/office/drawing/2016/5/11/chartex" xmlns:cx6="http://schemas.microsoft.com/office/drawing/2016/5/12/chartex" xmlns:cx7="http://schemas.microsoft.com/office/drawing/2016/5/13/chartex" xmlns:cx8="http://schemas.microsoft.com/office/drawing/2016/5/14/chartex" xmlns:mc="http://schemas.openxmlformats.org/markup-compatibility/2006" xmlns:aink="http://schemas.microsoft.com/office/drawing/2016/ink" xmlns:am3d="http://schemas.microsoft.com/office/drawing/2017/model3d" xmlns:o="urn:schemas-microsoft-com:office:office" xmlns:r="http://schemas.openxmlformats.org/officeDocument/2006/relationships" xmlns:m="http://schemas.openxmlformats.org/officeDocument/2006/math" xmlns:v="urn:schemas-microsoft-com:vml" xmlns:wp14="http://schemas.microsoft.com/office/word/2010/wordprocessingDrawing" xmlns:wp="http://schemas.openxmlformats.org/drawingml/2006/wordprocessingDrawing" xmlns:w10="urn:schemas-microsoft-com:office:word" xmlns:w="http://schemas.openxmlformats.org/wordprocessingml/2006/main" xmlns:w14="http://schemas.microsoft.com/office/word/2010/wordml" xmlns:w15="http://schemas.microsoft.com/office/word/2012/wordml" xmlns:w16cex="http://schemas.microsoft.com/office/word/2018/wordml/cex" xmlns:w16cid="http://schemas.microsoft.com/office/word/2016/wordml/cid" xmlns:w16="http://schemas.microsoft.com/office/word/2018/wordml" xmlns:w16sdtdh="http://schemas.microsoft.com/office/word/2020/wordml/sdtdatahash" xmlns:w16se="http://schemas.microsoft.com/office/word/2015/wordml/symex" xmlns:wpg="http://schemas.microsoft.com/office/word/2010/wordprocessingGroup" xmlns:wpi="http://schemas.microsoft.com/office/word/2010/wordprocessingInk" xmlns:wne="http://schemas.microsoft.com/office/word/2006/wordml" xmlns:wps="http://schemas.microsoft.com/office/word/2010/wordprocessingShape" mc:Ignorable="w14 w15 w16se w16cid w16 w16cex w16sdtdh wp14">
   <w:docParts>
     <w:docPart>
       <w:docPartPr>
@@ -24893,11 +24551,11 @@
 </file>
 
 <file path=word/glossary/fontTable.xml><?xml version="1.0" encoding="utf-8"?>
-<w:fonts xmlns:mc="http://schemas.openxmlformats.org/markup-compatibility/2006" xmlns:r="http://schemas.openxmlformats.org/officeDocument/2006/relationships" xmlns:w="http://schemas.openxmlformats.org/wordprocessingml/2006/main" xmlns:w14="http://schemas.microsoft.com/office/word/2010/wordml" xmlns:w15="http://schemas.microsoft.com/office/word/2012/wordml" xmlns:w16cex="http://schemas.microsoft.com/office/word/2018/wordml/cex" xmlns:w16cid="http://schemas.microsoft.com/office/word/2016/wordml/cid" xmlns:w16="http://schemas.microsoft.com/office/word/2018/wordml" xmlns:w16du="http://schemas.microsoft.com/office/word/2023/wordml/word16du" xmlns:w16sdtdh="http://schemas.microsoft.com/office/word/2020/wordml/sdtdatahash" xmlns:w16sdtfl="http://schemas.microsoft.com/office/word/2024/wordml/sdtformatlock" xmlns:w16se="http://schemas.microsoft.com/office/word/2015/wordml/symex" mc:Ignorable="w14 w15 w16se w16cid w16 w16cex w16sdtdh w16sdtfl w16du">
+<w:fonts xmlns:mc="http://schemas.openxmlformats.org/markup-compatibility/2006" xmlns:r="http://schemas.openxmlformats.org/officeDocument/2006/relationships" xmlns:w="http://schemas.openxmlformats.org/wordprocessingml/2006/main" xmlns:w14="http://schemas.microsoft.com/office/word/2010/wordml" xmlns:w15="http://schemas.microsoft.com/office/word/2012/wordml" xmlns:w16cex="http://schemas.microsoft.com/office/word/2018/wordml/cex" xmlns:w16cid="http://schemas.microsoft.com/office/word/2016/wordml/cid" xmlns:w16="http://schemas.microsoft.com/office/word/2018/wordml" xmlns:w16sdtdh="http://schemas.microsoft.com/office/word/2020/wordml/sdtdatahash" xmlns:w16se="http://schemas.microsoft.com/office/word/2015/wordml/symex" mc:Ignorable="w14 w15 w16se w16cid w16 w16cex w16sdtdh">
   <w:font w:name="Symbol">
     <w:panose1 w:val="05050102010706020507"/>
     <w:charset w:val="02"/>
-    <w:family w:val="decorative"/>
+    <w:family w:val="roman"/>
     <w:pitch w:val="variable"/>
     <w:sig w:usb0="00000000" w:usb1="10000000" w:usb2="00000000" w:usb3="00000000" w:csb0="80000000" w:csb1="00000000"/>
   </w:font>
@@ -24917,10 +24575,10 @@
   </w:font>
   <w:font w:name="Wingdings">
     <w:panose1 w:val="05000000000000000000"/>
-    <w:charset w:val="4D"/>
-    <w:family w:val="decorative"/>
+    <w:charset w:val="02"/>
+    <w:family w:val="auto"/>
     <w:pitch w:val="variable"/>
-    <w:sig w:usb0="00000003" w:usb1="00000000" w:usb2="00000000" w:usb3="00000000" w:csb0="80000001" w:csb1="00000000"/>
+    <w:sig w:usb0="00000000" w:usb1="10000000" w:usb2="00000000" w:usb3="00000000" w:csb0="80000000" w:csb1="00000000"/>
   </w:font>
   <w:font w:name="Calibri">
     <w:panose1 w:val="020F0502020204030204"/>
@@ -24959,31 +24617,16 @@
     <w:sig w:usb0="E4002EFF" w:usb1="C200247B" w:usb2="00000009" w:usb3="00000000" w:csb0="000001FF" w:csb1="00000000"/>
   </w:font>
   <w:font w:name="Yu Mincho">
-    <w:panose1 w:val="02020400000000000000"/>
     <w:charset w:val="80"/>
     <w:family w:val="roman"/>
     <w:pitch w:val="variable"/>
     <w:sig w:usb0="800002E7" w:usb1="2AC7FCFF" w:usb2="00000012" w:usb3="00000000" w:csb0="0002009F" w:csb1="00000000"/>
   </w:font>
-  <w:font w:name="Aptos">
-    <w:panose1 w:val="020B0004020202020204"/>
-    <w:charset w:val="00"/>
-    <w:family w:val="swiss"/>
-    <w:pitch w:val="variable"/>
-    <w:sig w:usb0="20000287" w:usb1="00000003" w:usb2="00000000" w:usb3="00000000" w:csb0="0000019F" w:csb1="00000000"/>
-  </w:font>
-  <w:font w:name="Aptos Display">
-    <w:panose1 w:val="020B0004020202020204"/>
-    <w:charset w:val="00"/>
-    <w:family w:val="swiss"/>
-    <w:pitch w:val="variable"/>
-    <w:sig w:usb0="20000287" w:usb1="00000003" w:usb2="00000000" w:usb3="00000000" w:csb0="0000019F" w:csb1="00000000"/>
-  </w:font>
 </w:fonts>
 </file>
 
 <file path=word/glossary/settings.xml><?xml version="1.0" encoding="utf-8"?>
-<w:settings xmlns:mc="http://schemas.openxmlformats.org/markup-compatibility/2006" xmlns:o="urn:schemas-microsoft-com:office:office" xmlns:r="http://schemas.openxmlformats.org/officeDocument/2006/relationships" xmlns:m="http://schemas.openxmlformats.org/officeDocument/2006/math" xmlns:v="urn:schemas-microsoft-com:vml" xmlns:w10="urn:schemas-microsoft-com:office:word" xmlns:w="http://schemas.openxmlformats.org/wordprocessingml/2006/main" xmlns:w14="http://schemas.microsoft.com/office/word/2010/wordml" xmlns:w15="http://schemas.microsoft.com/office/word/2012/wordml" xmlns:w16cex="http://schemas.microsoft.com/office/word/2018/wordml/cex" xmlns:w16cid="http://schemas.microsoft.com/office/word/2016/wordml/cid" xmlns:w16="http://schemas.microsoft.com/office/word/2018/wordml" xmlns:w16du="http://schemas.microsoft.com/office/word/2023/wordml/word16du" xmlns:w16sdtdh="http://schemas.microsoft.com/office/word/2020/wordml/sdtdatahash" xmlns:w16sdtfl="http://schemas.microsoft.com/office/word/2024/wordml/sdtformatlock" xmlns:w16se="http://schemas.microsoft.com/office/word/2015/wordml/symex" xmlns:sl="http://schemas.openxmlformats.org/schemaLibrary/2006/main" mc:Ignorable="w14 w15 w16se w16cid w16 w16cex w16sdtdh w16sdtfl w16du">
+<w:settings xmlns:mc="http://schemas.openxmlformats.org/markup-compatibility/2006" xmlns:o="urn:schemas-microsoft-com:office:office" xmlns:r="http://schemas.openxmlformats.org/officeDocument/2006/relationships" xmlns:m="http://schemas.openxmlformats.org/officeDocument/2006/math" xmlns:v="urn:schemas-microsoft-com:vml" xmlns:w10="urn:schemas-microsoft-com:office:word" xmlns:w="http://schemas.openxmlformats.org/wordprocessingml/2006/main" xmlns:w14="http://schemas.microsoft.com/office/word/2010/wordml" xmlns:w15="http://schemas.microsoft.com/office/word/2012/wordml" xmlns:w16cex="http://schemas.microsoft.com/office/word/2018/wordml/cex" xmlns:w16cid="http://schemas.microsoft.com/office/word/2016/wordml/cid" xmlns:w16="http://schemas.microsoft.com/office/word/2018/wordml" xmlns:w16sdtdh="http://schemas.microsoft.com/office/word/2020/wordml/sdtdatahash" xmlns:w16se="http://schemas.microsoft.com/office/word/2015/wordml/symex" xmlns:sl="http://schemas.openxmlformats.org/schemaLibrary/2006/main" mc:Ignorable="w14 w15 w16se w16cid w16 w16cex w16sdtdh">
   <w:view w:val="normal"/>
   <w:defaultTabStop w:val="708"/>
   <w:hyphenationZone w:val="425"/>
@@ -25015,6 +24658,7 @@
     <w:rsid w:val="005A5BEE"/>
     <w:rsid w:val="006D29C6"/>
     <w:rsid w:val="0077239B"/>
+    <w:rsid w:val="00777EE0"/>
     <w:rsid w:val="008724E2"/>
     <w:rsid w:val="009C4132"/>
     <w:rsid w:val="009E0000"/>
@@ -25023,6 +24667,7 @@
     <w:rsid w:val="00A92590"/>
     <w:rsid w:val="00AC13E3"/>
     <w:rsid w:val="00AF2C96"/>
+    <w:rsid w:val="00CB7CB6"/>
     <w:rsid w:val="00D348EA"/>
     <w:rsid w:val="00DA4981"/>
     <w:rsid w:val="00E36221"/>
@@ -25047,14 +24692,14 @@
   </m:mathPr>
   <w:themeFontLang w:val="es-EC"/>
   <w:clrSchemeMapping w:bg1="light1" w:t1="dark1" w:bg2="light2" w:t2="dark2" w:accent1="accent1" w:accent2="accent2" w:accent3="accent3" w:accent4="accent4" w:accent5="accent5" w:accent6="accent6" w:hyperlink="hyperlink" w:followedHyperlink="followedHyperlink"/>
-  <w:decimalSymbol w:val=","/>
+  <w:decimalSymbol w:val="."/>
   <w:listSeparator w:val=";"/>
   <w15:chartTrackingRefBased/>
 </w:settings>
 </file>
 
 <file path=word/glossary/styles.xml><?xml version="1.0" encoding="utf-8"?>
-<w:styles xmlns:mc="http://schemas.openxmlformats.org/markup-compatibility/2006" xmlns:r="http://schemas.openxmlformats.org/officeDocument/2006/relationships" xmlns:w="http://schemas.openxmlformats.org/wordprocessingml/2006/main" xmlns:w14="http://schemas.microsoft.com/office/word/2010/wordml" xmlns:w15="http://schemas.microsoft.com/office/word/2012/wordml" xmlns:w16cex="http://schemas.microsoft.com/office/word/2018/wordml/cex" xmlns:w16cid="http://schemas.microsoft.com/office/word/2016/wordml/cid" xmlns:w16="http://schemas.microsoft.com/office/word/2018/wordml" xmlns:w16du="http://schemas.microsoft.com/office/word/2023/wordml/word16du" xmlns:w16sdtdh="http://schemas.microsoft.com/office/word/2020/wordml/sdtdatahash" xmlns:w16sdtfl="http://schemas.microsoft.com/office/word/2024/wordml/sdtformatlock" xmlns:w16se="http://schemas.microsoft.com/office/word/2015/wordml/symex" mc:Ignorable="w14 w15 w16se w16cid w16 w16cex w16sdtdh w16sdtfl w16du">
+<w:styles xmlns:mc="http://schemas.openxmlformats.org/markup-compatibility/2006" xmlns:r="http://schemas.openxmlformats.org/officeDocument/2006/relationships" xmlns:w="http://schemas.openxmlformats.org/wordprocessingml/2006/main" xmlns:w14="http://schemas.microsoft.com/office/word/2010/wordml" xmlns:w15="http://schemas.microsoft.com/office/word/2012/wordml" xmlns:w16cex="http://schemas.microsoft.com/office/word/2018/wordml/cex" xmlns:w16cid="http://schemas.microsoft.com/office/word/2016/wordml/cid" xmlns:w16="http://schemas.microsoft.com/office/word/2018/wordml" xmlns:w16sdtdh="http://schemas.microsoft.com/office/word/2020/wordml/sdtdatahash" xmlns:w16se="http://schemas.microsoft.com/office/word/2015/wordml/symex" mc:Ignorable="w14 w15 w16se w16cid w16 w16cex w16sdtdh">
   <w:docDefaults>
     <w:rPrDefault>
       <w:rPr>
@@ -25543,7 +25188,7 @@
 </file>
 
 <file path=word/glossary/webSettings.xml><?xml version="1.0" encoding="utf-8"?>
-<w:webSettings xmlns:mc="http://schemas.openxmlformats.org/markup-compatibility/2006" xmlns:r="http://schemas.openxmlformats.org/officeDocument/2006/relationships" xmlns:w="http://schemas.openxmlformats.org/wordprocessingml/2006/main" xmlns:w14="http://schemas.microsoft.com/office/word/2010/wordml" xmlns:w15="http://schemas.microsoft.com/office/word/2012/wordml" xmlns:w16cex="http://schemas.microsoft.com/office/word/2018/wordml/cex" xmlns:w16cid="http://schemas.microsoft.com/office/word/2016/wordml/cid" xmlns:w16="http://schemas.microsoft.com/office/word/2018/wordml" xmlns:w16du="http://schemas.microsoft.com/office/word/2023/wordml/word16du" xmlns:w16sdtdh="http://schemas.microsoft.com/office/word/2020/wordml/sdtdatahash" xmlns:w16sdtfl="http://schemas.microsoft.com/office/word/2024/wordml/sdtformatlock" xmlns:w16se="http://schemas.microsoft.com/office/word/2015/wordml/symex" mc:Ignorable="w14 w15 w16se w16cid w16 w16cex w16sdtdh w16sdtfl w16du">
+<w:webSettings xmlns:mc="http://schemas.openxmlformats.org/markup-compatibility/2006" xmlns:r="http://schemas.openxmlformats.org/officeDocument/2006/relationships" xmlns:w="http://schemas.openxmlformats.org/wordprocessingml/2006/main" xmlns:w14="http://schemas.microsoft.com/office/word/2010/wordml" xmlns:w15="http://schemas.microsoft.com/office/word/2012/wordml" xmlns:w16cex="http://schemas.microsoft.com/office/word/2018/wordml/cex" xmlns:w16cid="http://schemas.microsoft.com/office/word/2016/wordml/cid" xmlns:w16="http://schemas.microsoft.com/office/word/2018/wordml" xmlns:w16sdtdh="http://schemas.microsoft.com/office/word/2020/wordml/sdtdatahash" xmlns:w16se="http://schemas.microsoft.com/office/word/2015/wordml/symex" mc:Ignorable="w14 w15 w16se w16cid w16 w16cex w16sdtdh">
   <w:optimizeForBrowser/>
   <w:allowPNG/>
 </w:webSettings>
@@ -25937,6 +25582,19 @@
 </file>
 
 <file path=customXml/item2.xml><?xml version="1.0" encoding="utf-8"?>
+<?mso-contentType ?>
+<FormTemplates xmlns="http://schemas.microsoft.com/sharepoint/v3/contenttype/forms">
+  <Display>DocumentLibraryForm</Display>
+  <Edit>DocumentLibraryForm</Edit>
+  <New>DocumentLibraryForm</New>
+</FormTemplates>
+</file>
+
+<file path=customXml/item3.xml><?xml version="1.0" encoding="utf-8"?>
+<b:Sources xmlns:b="http://schemas.openxmlformats.org/officeDocument/2006/bibliography" xmlns="http://schemas.openxmlformats.org/officeDocument/2006/bibliography" SelectedStyle="/APASixthEditionOfficeOnline.xsl" StyleName="APA" Version="6"/>
+</file>
+
+<file path=customXml/item4.xml><?xml version="1.0" encoding="utf-8"?>
 <ct:contentTypeSchema xmlns:ct="http://schemas.microsoft.com/office/2006/metadata/contentType" xmlns:ma="http://schemas.microsoft.com/office/2006/metadata/properties/metaAttributes" ct:_="" ma:_="" ma:contentTypeName="Documento" ma:contentTypeID="0x01010006ACA7DB3593B24E887290A71F51A18F" ma:contentTypeVersion="10" ma:contentTypeDescription="Crear nuevo documento." ma:contentTypeScope="" ma:versionID="5fde8b866a40f115df17144418c3774a">
   <xsd:schema xmlns:xsd="http://www.w3.org/2001/XMLSchema" xmlns:xs="http://www.w3.org/2001/XMLSchema" xmlns:p="http://schemas.microsoft.com/office/2006/metadata/properties" xmlns:ns2="e62bc30b-b884-4ee1-b0ab-e2e35dfacfd5" targetNamespace="http://schemas.microsoft.com/office/2006/metadata/properties" ma:root="true" ma:fieldsID="722d0d74b5f1a0e9a135ab2398c17b72" ns2:_="">
     <xsd:import namespace="e62bc30b-b884-4ee1-b0ab-e2e35dfacfd5"/>
@@ -26116,19 +25774,6 @@
 </ct:contentTypeSchema>
 </file>
 
-<file path=customXml/item3.xml><?xml version="1.0" encoding="utf-8"?>
-<b:Sources xmlns:b="http://schemas.openxmlformats.org/officeDocument/2006/bibliography" xmlns="http://schemas.openxmlformats.org/officeDocument/2006/bibliography" SelectedStyle="/APASixthEditionOfficeOnline.xsl" StyleName="APA" Version="6"/>
-</file>
-
-<file path=customXml/item4.xml><?xml version="1.0" encoding="utf-8"?>
-<?mso-contentType ?>
-<FormTemplates xmlns="http://schemas.microsoft.com/sharepoint/v3/contenttype/forms">
-  <Display>DocumentLibraryForm</Display>
-  <Edit>DocumentLibraryForm</Edit>
-  <New>DocumentLibraryForm</New>
-</FormTemplates>
-</file>
-
 <file path=customXml/itemProps1.xml><?xml version="1.0" encoding="utf-8"?>
 <ds:datastoreItem xmlns:ds="http://schemas.openxmlformats.org/officeDocument/2006/customXml" ds:itemID="{DAAF528F-7240-408A-9BF0-E37AC9702D32}">
   <ds:schemaRefs>
@@ -26140,6 +25785,22 @@
 </file>
 
 <file path=customXml/itemProps2.xml><?xml version="1.0" encoding="utf-8"?>
+<ds:datastoreItem xmlns:ds="http://schemas.openxmlformats.org/officeDocument/2006/customXml" ds:itemID="{7E3075BF-FDAF-4D4D-8DC1-23126609A178}">
+  <ds:schemaRefs>
+    <ds:schemaRef ds:uri="http://schemas.microsoft.com/sharepoint/v3/contenttype/forms"/>
+  </ds:schemaRefs>
+</ds:datastoreItem>
+</file>
+
+<file path=customXml/itemProps3.xml><?xml version="1.0" encoding="utf-8"?>
+<ds:datastoreItem xmlns:ds="http://schemas.openxmlformats.org/officeDocument/2006/customXml" ds:itemID="{BE0E3CBB-9640-C643-97A5-411B9F838128}">
+  <ds:schemaRefs>
+    <ds:schemaRef ds:uri="http://schemas.openxmlformats.org/officeDocument/2006/bibliography"/>
+  </ds:schemaRefs>
+</ds:datastoreItem>
+</file>
+
+<file path=customXml/itemProps4.xml><?xml version="1.0" encoding="utf-8"?>
 <ds:datastoreItem xmlns:ds="http://schemas.openxmlformats.org/officeDocument/2006/customXml" ds:itemID="{BB19413B-A659-4239-B251-6BE967D5DACB}">
   <ds:schemaRefs>
     <ds:schemaRef ds:uri="http://schemas.microsoft.com/office/2006/metadata/contentType"/>
@@ -26155,20 +25816,4 @@
     <ds:schemaRef ds:uri="http://schemas.microsoft.com/internal/obd"/>
   </ds:schemaRefs>
 </ds:datastoreItem>
-</file>
-
-<file path=customXml/itemProps3.xml><?xml version="1.0" encoding="utf-8"?>
-<ds:datastoreItem xmlns:ds="http://schemas.openxmlformats.org/officeDocument/2006/customXml" ds:itemID="{BE0E3CBB-9640-C643-97A5-411B9F838128}">
-  <ds:schemaRefs>
-    <ds:schemaRef ds:uri="http://schemas.openxmlformats.org/officeDocument/2006/bibliography"/>
-  </ds:schemaRefs>
-</ds:datastoreItem>
-</file>
-
-<file path=customXml/itemProps4.xml><?xml version="1.0" encoding="utf-8"?>
-<ds:datastoreItem xmlns:ds="http://schemas.openxmlformats.org/officeDocument/2006/customXml" ds:itemID="{7E3075BF-FDAF-4D4D-8DC1-23126609A178}">
-  <ds:schemaRefs>
-    <ds:schemaRef ds:uri="http://schemas.microsoft.com/sharepoint/v3/contenttype/forms"/>
-  </ds:schemaRefs>
-</ds:datastoreItem>
 </file>
</xml_diff>